<commit_message>
Testmethodik: Symbol-/Konzentrations-Check als verbindlichen Standard ergaenzt
Ausloeser: R-5.10-Analyse (29.07.) zeigte eine naiv alarmierende Win-Rate, die
sich als Symbol-/Rally-Artefakt entpuppte (5 Symbole = fast alle Treffer).
Ab sofort verbindlich (Abschnitt 2.5): vor jeder Muster-Interpretation aus
Veto-Schatten-/Provider-Performance-/Konfidenz-Band-Daten Win-Rate/CRV
zusaetzlich ohne die 3-5 haeufigsten Symbole pruefen.

Abschnitt 2.5.1 stellt klar, dass der Check kein Diversifikations-Erfordernis
des Handelssystems ist - Massstab ist Unabhaengigkeit der Beobachtungen, nicht
Symbolanzahl. Eine bewusst schmale Watchlist ist kein Konzentrationsproblem,
solange die Beobachtungen ueber unterschiedliche Marktphasen gestreut sind.

Co-Authored-By: Claude Sonnet 5 <noreply@anthropic.com>
</commit_message>
<xml_diff>
--- a/Basisinfos/Test_und_Verifikationsmethodik.docx
+++ b/Basisinfos/Test_und_Verifikationsmethodik.docx
@@ -1044,6 +1044,122 @@
         <w:t>Abschnitt 0 statt einem unscharfen "erledigt".</w:t>
       </w:r>
     </w:p>
+    <w:p>
+      <w:pPr>
+        <w:pStyle w:val="Heading3"/>
+      </w:pPr>
+      <w:r>
+        <w:t>2.5 Symbol-/Konzentrations-Check vor jeder Muster-Interpretation (verbindlich)</w:t>
+      </w:r>
+    </w:p>
+    <w:p>
+      <w:pPr/>
+      <w:r>
+        <w:t>Ausloeser: die R-5.10-Analyse (29.07.) zeigte eine naiv alarmierende Zahl (n=80, 55% Win-Rate, +0,64 CRV bei konfidenz-vetoten Spot-Signalen), die sich bei genauerem Hinsehen als Artefakt einer Handvoll gut laufender Symbole entpuppte (5 Symbole = 29/29 Treffer, ohne sie nur noch 29,4% WR bei den restlichen 51). Eine zweite, strukturell aehnliche Pruefung am selben Tag (Hebel-Konfidenz-Baender) ergab dagegen ein robustes Ergebnis - der Unterschied wurde erst durch diesen Check sichtbar.</w:t>
+      </w:r>
+    </w:p>
+    <w:p>
+      <w:pPr/>
+      <w:r>
+        <w:t>Ab sofort verbindlich, bevor eine Win-Rate/CRV-Kennzahl aus Veto-Schatten-, Provider-Performance- oder Konfidenz-Band-Daten als "Muster"/"Erkenntnis" interpretiert oder gar in eine Handlungsempfehlung uebersetzt wird:</w:t>
+      </w:r>
+    </w:p>
+    <w:p>
+      <w:pPr>
+        <w:pStyle w:val="ListNumber"/>
+      </w:pPr>
+      <w:r>
+        <w:t>Anzahl unterschiedlicher Symbole in der Stichprobe ermitteln (nicht nur Gesamt-n).</w:t>
+      </w:r>
+    </w:p>
+    <w:p>
+      <w:pPr>
+        <w:pStyle w:val="ListNumber"/>
+      </w:pPr>
+      <w:r>
+        <w:t>Win-Rate/CRV zusaetzlich OHNE die 3-5 haeufigsten Symbole berechnen.</w:t>
+      </w:r>
+    </w:p>
+    <w:p>
+      <w:pPr>
+        <w:pStyle w:val="ListNumber"/>
+      </w:pPr>
+      <w:r>
+        <w:t>Bewegt sich die Kennzahl dabei deutlich (&gt;10 Prozentpunkte WR oder Vorzeichenwechsel beim CRV), gilt der Befund als NICHT robust - vermutlich Symbol-/Rally-Artefakt, nicht als Kalibrierungsluecke behandeln, keine Schwellenwert-Aenderung darauf stuetzen.</w:t>
+      </w:r>
+    </w:p>
+    <w:p>
+      <w:pPr>
+        <w:pStyle w:val="ListNumber"/>
+      </w:pPr>
+      <w:r>
+        <w:t>Bleibt die Kennzahl stabil, gilt der Befund als robust und kann als echte Erkenntnis dokumentiert und diskutiert werden.</w:t>
+      </w:r>
+    </w:p>
+    <w:p>
+      <w:pPr/>
+      <w:r>
+        <w:t>Diese Pruefung wird in Abschnitt 3 der jeweiligen Analyse-Zusammenfassung (Chat oder Memory) kurz mit ausgewiesen (Anzahl Symbole, WR mit/ohne Top-N), nicht nur das Endergebnis genannt.</w:t>
+      </w:r>
+    </w:p>
+    <w:p>
+      <w:pPr>
+        <w:pStyle w:val="Heading4"/>
+      </w:pPr>
+      <w:r>
+        <w:t>2.5.1 Klarstellung: was der Check NICHT bedeutet (Nachtrag 29.07.)</w:t>
+      </w:r>
+    </w:p>
+    <w:p>
+      <w:pPr/>
+      <w:r>
+        <w:t>Ausloeser: Nutzer-Nachfrage, ob eine bewusst schmale Watchlist (z.B. nur BTC/ETH/SOL) das System damit faktisch unbenutzbar macht, und ob die Handelslogik ueberhaupt von Diversifikation abhaengen sollte (Gegenbeispiel des Nutzers: bei Hebel laufen aktuell sowohl BTC als auch ein Memecoin - an fehlender Asset-Vielfalt kann und sollte es also nicht liegen).</w:t>
+      </w:r>
+    </w:p>
+    <w:p>
+      <w:pPr/>
+      <w:r>
+        <w:rPr>
+          <w:b/>
+        </w:rPr>
+        <w:t xml:space="preserve">Der eigentliche Massstab ist Unabhaengigkeit der Beobachtungen, nicht Anzahl der Symbole. </w:t>
+      </w:r>
+      <w:r>
+        <w:t>Symbol-Vielfalt ist nur der aktuell naechstliegende Proxy dafuer, weil die bisherigen Datenmengen ihre scheinbare Groesse oft aus wiederholtem Cooldown-Re-Signalisieren DESSELBEN Coins waehrend EINER zusammenhaengenden Marktbewegung beziehen (viele DB-Zeilen, aber wenige echte, unabhaengige Marktereignisse dahinter). Daraus folgt:</w:t>
+      </w:r>
+    </w:p>
+    <w:p>
+      <w:pPr>
+        <w:pStyle w:val="ListBullet"/>
+      </w:pPr>
+      <w:r>
+        <w:t>Eine schmale, bewusst gewaehlte Watchlist (wenige Symbole) ist fuer sich genommen KEIN Konzentrationsproblem. Dieselben 2-3 Symbole ueber einen langen Zeitraum hinweg, der mehrere echte, unterschiedliche Marktphasen (Bulle/Baer/Seitwaerts) abdeckt, liefern genauso unabhaengige Datenpunkte wie viele verschiedene Symbole - nur ueber die Zeit-Achse gestreut statt ueber die Symbol-Achse. Das Betriebs-System selbst braucht keine Symbol-Vielfalt, um zu funktionieren.</w:t>
+      </w:r>
+    </w:p>
+    <w:p>
+      <w:pPr>
+        <w:pStyle w:val="ListBullet"/>
+      </w:pPr>
+      <w:r>
+        <w:t>Die Handelslogik/Regeln sollen asset-agnostisch funktionieren (BTC und ein Memecoin gleichermassen abgedeckt) - der Check unterstellt nicht das Gegenteil. Er prueft nur, ob eine konkrete Kennzahl (z.B. "46% Win-Rate bei Regel X") tatsaechlich die generelle Wirkung der Regel zeigt, oder ob sie nur "diese 3 Symbole liefen in dieser einen Woche gut" beweist - was bei einer Schwellenwert-Aenderung faelschlich auf ALLE kuenftigen Symbole/Situationen verallgemeinert wuerde.</w:t>
+      </w:r>
+    </w:p>
+    <w:p>
+      <w:pPr>
+        <w:pStyle w:val="ListBullet"/>
+      </w:pPr>
+      <w:r>
+        <w:t>Bei einer schmalen Watchlist ist der Symbol-Check durch einen Zeitfenster-Unabhaengigkeits-Check zu ERSETZEN bzw. zu ergaenzen: sind die Gewinn-/Verlust-Faelle ueber mehrere klar unterschiedliche Marktphasen verteilt, oder stammen sie praktisch alle aus einer einzigen zusammenhaengenden Bewegung? Gleiches Prinzip, andere Achse.</w:t>
+      </w:r>
+    </w:p>
+    <w:p>
+      <w:pPr>
+        <w:pStyle w:val="ListBullet"/>
+      </w:pPr>
+      <w:r>
+        <w:t>Die "&gt;10 Prozentpunkte"-Schwelle aus 2.5 ist bereits genau dafuer gebaut, "ab welcher Menge kein Problem mehr" zu beantworten: nicht als feste Symbolanzahl, sondern als Test, ob der Effekt beim Entfernen der dominantesten paar Symbole verschwindet oder stabil bleibt.</w:t>
+      </w:r>
+    </w:p>
     <w:sectPr>
       <w:pgSz w:w="12240" w:h="15840"/>
       <w:pgMar w:top="1440" w:right="1800" w:bottom="1440" w:left="1800" w:header="720" w:footer="720" w:gutter="0"/>

</xml_diff>

<commit_message>
Testmethodik: Backtest-Overfitting-Schwelle nachgeschaerft (externe Recherche)
Externe Recherche (Bailey/Lopez de Prado, Harvey/Liu/Zhu) zu Backtest-
Overfitting und Multiple-Testing praezisiert die bisherige vage
">10-Prozentpunkte"-Symbol-Konzentrations-Regel: ein Backtest-Muster wird
jetzt erst ab n>=50 UND max. 20-25% Anteil eines Einzelsymbols
operationalisiert. Effektive Stichprobengroesse bei geclusterten
Beobachtungen ist die Anzahl distinkter Symbole, nicht die Roh-Zeilenzahl.

Co-Authored-By: Claude Sonnet 5 <noreply@anthropic.com>
</commit_message>
<xml_diff>
--- a/Basisinfos/Test_und_Verifikationsmethodik.docx
+++ b/Basisinfos/Test_und_Verifikationsmethodik.docx
@@ -1160,6 +1160,26 @@
         <w:t>Die "&gt;10 Prozentpunkte"-Schwelle aus 2.5 ist bereits genau dafuer gebaut, "ab welcher Menge kein Problem mehr" zu beantworten: nicht als feste Symbolanzahl, sondern als Test, ob der Effekt beim Entfernen der dominantesten paar Symbole verschwindet oder stabil bleibt.</w:t>
       </w:r>
     </w:p>
+    <w:p>
+      <w:pPr>
+        <w:pStyle w:val="Heading4"/>
+      </w:pPr>
+      <w:r>
+        <w:t>Nachgeschärfte Mindestschwelle (Nachtrag 29.07., externe Recherche zu Backtest-Overfitting)</w:t>
+      </w:r>
+    </w:p>
+    <w:p>
+      <w:pPr/>
+      <w:r>
+        <w:t>Quellen: Bailey/Lopez de Prado, "The Probability of Backtest Overfitting"; Harvey/Liu/Zhu zu Multiple-Testing bei Handelsstrategien. Ein aus einem Backtest abgeleitetes Muster wird NIE operationalisiert (kein Gate, kein Deckel, keine Schwellenwert-Änderung), solange (a) n &lt; 50 ODER (b) ein einzelnes Symbol &gt; 20-25% der Fälle stellt. Bei geclusterten Beobachtungen (mehrere Signale desselben Symbols aus derselben Marktbewegung) ist die EFFEKTIVE Stichprobengröße die Anzahl distinkter Symbole, nicht die Roh-Zeilenzahl - analog zu "clustered standard errors" in der Ökonometrie. Jede Analyse-Zusammenfassung weist deshalb IMMER beide Zahlen aus: Roh-n UND Anzahl distinkter Symbole.</w:t>
+      </w:r>
+    </w:p>
+    <w:p>
+      <w:pPr/>
+      <w:r>
+        <w:t>Zusätzlich: informell nacheinander getestete Hypothesen (z.B. "Deckel bauen" → "Gegenteil scheint zu gelten" → "Kontrolle zeigt Artefakt") sind ein Multiple-Testing-Szenario - ein gefundener Effekt gilt bei jeder Zwischenstufe zunächst nur als hypothesengenerierend, nicht als bestätigt, bis er nach unabhängiger Replikation (neuer Zeitraum/neue Symbole) noch Bestand hat.</w:t>
+      </w:r>
+    </w:p>
     <w:sectPr>
       <w:pgSz w:w="12240" w:h="15840"/>
       <w:pgMar w:top="1440" w:right="1800" w:bottom="1440" w:left="1800" w:header="720" w:footer="720" w:gutter="0"/>

</xml_diff>

<commit_message>
Marktscan-Reifegrad-Scoring + Erfolgsmessung: 3-Mail-Architektur, CoinGecko-OHLC-Tracking, GUI Potential/Outcome
Schliesst eine bestehende Verdrahtungs-Luecke: Tier-2-Marktscan-Writeups verschwanden
seit dem E-Mail-Latenz-Fix stillschweigend, da der Dispatcher keinen "marktscan:"-Zweig
hatte. Neue Erfolgsmessung nutzt CoinGecko-OHLC statt Kraken (Marktscan-Coins sind meist
nicht Kraken-gelistet), CRV=0,8 rechnerisch hergeleitet. Benachrichtigung in 3 getrennte
Mails aufgeteilt statt einer gebuendelten (Kaufkandidat-Writeup / Watchlist-"heiss" /
Schnellerfolg), nach Nutzer-Feedback zur urspruenglichen Planung.

Co-Authored-By: Claude Sonnet 5 <noreply@anthropic.com>
</commit_message>
<xml_diff>
--- a/Basisinfos/Test_und_Verifikationsmethodik.docx
+++ b/Basisinfos/Test_und_Verifikationsmethodik.docx
@@ -1604,6 +1604,67 @@
         <w:t>Zusaetzlich bei derselben Gelegenheit festgestellt: die parallele CRV&lt;2,0-Veto-Teilauswertung (Krypto-Spot, n=18, urspruenglich als "Veto arbeitet korrekt" eingeordnet) unterschreitet die n&gt;=50-Mindestschwelle unabhaengig von der Konzentration (hier gut verteilt) - beide Krypto-Spot-Fragen bleiben damit offen, keine der beiden gilt als bestaetigt.</w:t>
       </w:r>
     </w:p>
+    <w:p>
+      <w:pPr>
+        <w:pStyle w:val="Heading3"/>
+      </w:pPr>
+      <w:r>
+        <w:t>2.5.3 Drittes Fallbeispiel: Marktscan-Score-Schwellen-Kalibrierung - Konzentration als Signal statt nur als Störfaktor (Nachtrag 30.07.)</w:t>
+      </w:r>
+    </w:p>
+    <w:p>
+      <w:r>
+        <w:t>Auslöser: die Frage, ob score_kaufkandidat_ab=70/score_watchlist_wuerdig_ab=50 (beide VORLAEUFIG) gut kalibriert sind. Ein Backtest gegen echte Notebook-Daten scheiterte am Symbol-Konzentrations-Check (2.5) - wenige Coins wurden immer wieder als Kandidat entdeckt, eine klassische Schwellen-Kalibrierung wäre auf dieser Basis nicht belastbar gewesen.</w:t>
+      </w:r>
+    </w:p>
+    <w:p>
+      <w:r>
+        <w:t>Der entscheidende Perspektivwechsel: statt die Konzentration nur als Störfaktor zu behandeln (der eine Frage unbeantwortbar macht), wurde sie selbst zur Fragestellung - "warum wird derselbe Coin so oft wiederentdeckt, und sagt DAS etwas über die künftige Performance aus?" Ein eigens dafür konstruierter Backtest (Streak-Position vs. Forward-Return, siehe Memory [[project_krypto_relativwert_bausteine]] und Regelwerksmanual-Nachtrag "Marktscan-Reifegrad-Scoring") bestätigte sauber (n=70 Coins mit ≥4 Tages-Sichtungen, OHNE Konzentrationsproblem in diesem spezifischen Test): Win-Rate fällt monoton von 57% (3. Sichtung) auf 36% (5. Sichtung).</w:t>
+      </w:r>
+    </w:p>
+    <w:p>
+      <w:r>
+        <w:t>Lehre: wenn der Symbol-Konzentrations-Check eine urspüngliche Fragestellung disqualifiziert, lohnt sich die Nachfrage, ob die Konzentration selbst (die Wiederholung) ein eigenständiges, bisher ungenutztes Signal ist - statt die Frage nur als "nicht beantwortbar" zu verwerfen. Bei der später gebauten Erfolgsmessung (Marktscan Teil 2) drehte sich diese Konzentration sogar zu einem PRAKTISCHEN Vorteil um: wenige distinkte Coins bedeuten günstigere gebündelte get_simple_prices()-Abrufe (ein API-Call für mehrere offene Messungen desselben Coins) statt vieler Einzelabrufe.</w:t>
+      </w:r>
+    </w:p>
+    <w:p>
+      <w:pPr>
+        <w:pStyle w:val="Heading3"/>
+      </w:pPr>
+      <w:r>
+        <w:t>2.8 Methodik-Vorlage: rechnerische Herleitung einer neuen Schwelle statt Schätzung (Nachtrag 30.07., Marktscan-CRV=0,8)</w:t>
+      </w:r>
+    </w:p>
+    <w:p>
+      <w:r>
+        <w:t>Auslöser: für die Marktscan-Erfolgsmessung wurde ein neuer, eigenständiger CRV-Schwellenwert gebraucht (getrennt von backward_tracking. richtungstreffer_mindest_crv=1,0, da Marktscan-Kandidaten ein anderes Volatilitätsprofil haben als Watchlist-Assets). Statt eine Zahl zu schätzen oder den bestehenden Wert unreflektiert zu übernehmen, wurde die Schwelle rechnerisch aus echten Daten hergeleitet - als wiederverwendbare Vorlage für künftige Schwellen-Kalibrierungen hier festgehalten:</w:t>
+      </w:r>
+    </w:p>
+    <w:p>
+      <w:r>
+        <w:t>1. Referenzgröße bestimmen: Ø absolute Tagesbewegung der betroffenen Grundgesamtheit berechnen (hier: 13,9% für Marktscan-Kandidaten, deutlich höher als bei etablierten Watchlist-Assets - die Volatilitätsprofile unterscheiden sich, ein pauschal übernommener Wert wäre nicht passend gewesen).</w:t>
+      </w:r>
+    </w:p>
+    <w:p>
+      <w:r>
+        <w:t>2. Forward-Return-Verteilung ermitteln: an mehreren Zeit-Horizonten prüfen (hier 12-24h UND 3 Tage), an welchem Perzentil (P70-P75) sich ein sinnvoller Ziel-Move ablesen lässt. Wenn die Verteilungen an verschiedenen Horizonten nahezu identisch sind (hier: P70 +9,1% vs. +7,5%), reicht EIN Schwellenwert für mehrere Anwendungsfälle (schnelle UND mehrtägige Erfolge) - keine Notwendigkeit, zwei getrennte Regeln zu bauen.</w:t>
+      </w:r>
+    </w:p>
+    <w:p>
+      <w:r>
+        <w:t>3. CRV-Äquivalent berechnen: Ziel-Move ÷ Referenzgröße aus Schritt 1 ergibt eine Bandbreite (hier 0,65-0,94 aus P70-P75), Empfehlung = Mitte der Bandbreite (hier 0,8).</w:t>
+      </w:r>
+    </w:p>
+    <w:p>
+      <w:r>
+        <w:t>4. Nutzer-Bestätigung einholen, bevor der Wert operationalisiert wird - eine rechnerisch hergeleitete Zahl ersetzt nicht die fachliche Freigabe, sie macht sie nur informierter.</w:t>
+      </w:r>
+    </w:p>
+    <w:p>
+      <w:r>
+        <w:t>Allgemeine Lehre: wann immer ein neuer Schwellenwert für eine andere Grundgesamtheit als eine bereits bestehende Regel gebraucht wird (anderes Volatilitätsprofil, andere Zeithorizonte, andere Assetklasse), lohnt sich dieselbe 4-Schritte-Herleitung, statt einen bestehenden Wert unreflektiert zu kopieren ODER eine neue Zahl zu schätzen. Dieselbe Methodik gilt spiegelbildlich auch für zeitbasierte Schwellen (siehe die parallel hergeleiteten Werte watchlist_heiss_fenster_stunden=48 und schnellerfolg_anteil_max=0,5 im selben Marktscan-Nachtrag - beide aus beobachteten Verteilungen abgeleitet, nicht geschätzt).</w:t>
+      </w:r>
+    </w:p>
     <w:sectPr>
       <w:pgSz w:w="12240" w:h="15840"/>
       <w:pgMar w:top="1440" w:right="1800" w:bottom="1440" w:left="1800" w:header="720" w:footer="720" w:gutter="0"/>

</xml_diff>

<commit_message>
docx-Lesekopien reproduzierbar erzeugen statt von Hand nachziehen
Die .docx-Varianten der Basisinfos-Referenzdokumente wurden bisher manuell
gepflegt und sind dabei mehrfach hinter ihrer .md zurueckgeblieben - beim
Regelwerksmanual-Split vom 02.08. am deutlichsten: die .docx enthielt noch
die ungeteilte 13.951-Zeilen-Fassung. Betroffen waren 3 Dokumente
(Regelwerksmanual, Test_und_Verifikationsmethodik, Kategorie_Basisinfos),
2 weitere hatten nie eine .docx (Regelwerk_Entscheidungslog, Spezifikation).

Neues build_docx.py erzeugt alle 6 aus der .md - die .md bleiben die Quelle
der Wahrheit, die .docx sind reine Lesekopien. "python build_docx.py
--pruefen" meldet kuenftig sofort, welche veraltet ist (Exit 1), damit die
Divergenz nicht wieder unbemerkt auflaeuft.

Bewusst kein Scheduler-Job: die .docx werden selten gebraucht, und ein
automatischer Lauf wuerde bei jedem Doku-Commit Binaerdateien mitaendern.

Co-Authored-By: Claude Opus 5 <noreply@anthropic.com>
</commit_message>
<xml_diff>
--- a/Basisinfos/Test_und_Verifikationsmethodik.docx
+++ b/Basisinfos/Test_und_Verifikationsmethodik.docx
@@ -11,7 +11,9 @@
       </w:r>
     </w:p>
     <w:p>
-      <w:pPr/>
+      <w:pPr>
+        <w:jc w:val="left"/>
+      </w:pPr>
       <w:r>
         <w:rPr>
           <w:b/>
@@ -19,81 +21,42 @@
         <w:t>Zweck:</w:t>
       </w:r>
       <w:r>
-        <w:t xml:space="preserve"> Dauerhafter Standard, kein einmaliges Protokoll. Bisher wurden Tests und</w:t>
+        <w:t xml:space="preserve"> Dauerhafter Standard, kein einmaliges Protokoll. Bisher wurden Tests und Notebook-Export-Analysen bei jeder Änderung neu und unterschiedlich tief erfunden - das macht Ergebnisse über die Zeit nicht vergleichbar und lässt leicht Unschärfe in Status-Angaben wie "erledigt" entstehen (siehe Abschnitt 0, Auslöser dieses Dokuments). Ziel: eine feste, wiederholbare Vorgehensweise für (A) synthetische Tests hier am Gerät und (B) die Analyse echter Notebook-Exporte, inklusive Lerneffekt über die Zeit.</w:t>
       </w:r>
     </w:p>
     <w:p>
-      <w:pPr/>
-      <w:r>
-        <w:t>Notebook-Export-Analysen bei jeder Änderung neu und unterschiedlich tief erfunden -</w:t>
+      <w:pPr>
+        <w:jc w:val="left"/>
+      </w:pPr>
+      <w:r>
+        <w:t>Stand: 2026-07-28. Bei Bedarf ergänzen, nicht neu erfinden.</w:t>
       </w:r>
     </w:p>
     <w:p>
-      <w:pPr/>
-      <w:r>
-        <w:t>das macht Ergebnisse über die Zeit nicht vergleichbar und lässt leicht Unschärfe in</w:t>
+      <w:pPr>
+        <w:spacing w:before="120"/>
+      </w:pPr>
+      <w:r>
+        <w:rPr>
+          <w:color w:val="AAAAAA"/>
+        </w:rPr>
+        <w:t>────────────────────────────────────────────────────────────</w:t>
       </w:r>
     </w:p>
     <w:p>
-      <w:pPr/>
-      <w:r>
-        <w:t>Status-Angaben wie "erledigt" entstehen (siehe Abschnitt 0, Auslöser dieses</w:t>
+      <w:pPr>
+        <w:pStyle w:val="Heading2"/>
+      </w:pPr>
+      <w:r>
+        <w:t>0. Status-Vokabular (Grundlage für alles Weitere)</w:t>
       </w:r>
     </w:p>
     <w:p>
-      <w:pPr/>
-      <w:r>
-        <w:t>Dokuments). Ziel: eine feste, wiederholbare Vorgehensweise für (A) synthetische</w:t>
-      </w:r>
-    </w:p>
-    <w:p>
-      <w:pPr/>
-      <w:r>
-        <w:t>Tests hier am Gerät und (B) die Analyse echter Notebook-Exporte, inklusive</w:t>
-      </w:r>
-    </w:p>
-    <w:p>
-      <w:pPr/>
-      <w:r>
-        <w:t>Lerneffekt über die Zeit.</w:t>
-      </w:r>
-    </w:p>
-    <w:p>
-      <w:pPr/>
-      <w:r>
-        <w:t>Stand: 2026-07-28. Bei Bedarf ergänzen, nicht neu erfinden.</w:t>
-      </w:r>
-    </w:p>
-    <w:p>
-      <w:pPr>
-        <w:pStyle w:val="Heading2"/>
-      </w:pPr>
-      <w:r>
-        <w:t>0. Status-Vokabular (Grundlage für alles Weitere)</w:t>
-      </w:r>
-    </w:p>
-    <w:p>
-      <w:pPr/>
-      <w:r>
-        <w:t>Auslöser: eine Änderung wurde in der Fakten-Entscheidungsmappe als "ERLEDIGT"</w:t>
-      </w:r>
-    </w:p>
-    <w:p>
-      <w:pPr/>
-      <w:r>
-        <w:t>bezeichnet, obwohl sie noch nicht committet war - Nutzer-Nachfrage machte deutlich,</w:t>
-      </w:r>
-    </w:p>
-    <w:p>
-      <w:pPr/>
-      <w:r>
-        <w:t>dass "erledigt"/"umgesetzt" ohne feste Bedeutung missverständlich ist. Ab sofort</w:t>
-      </w:r>
-    </w:p>
-    <w:p>
-      <w:pPr/>
-      <w:r>
-        <w:t>gilt für jede Änderung genau eine dieser fünf Stufen, immer explizit benannt:</w:t>
+      <w:pPr>
+        <w:jc w:val="left"/>
+      </w:pPr>
+      <w:r>
+        <w:t>Auslöser: eine Änderung wurde in der Fakten-Entscheidungsmappe als "ERLEDIGT" bezeichnet, obwohl sie noch nicht committet war - Nutzer-Nachfrage machte deutlich, dass "erledigt"/"umgesetzt" ohne feste Bedeutung missverständlich ist. Ab sofort gilt für jede Änderung genau eine dieser fünf Stufen, immer explizit benannt:</w:t>
       </w:r>
     </w:p>
     <w:p>
@@ -121,13 +84,7 @@
         <w:t>Verifiziert</w:t>
       </w:r>
       <w:r>
-        <w:t xml:space="preserve"> - synthetische Tests bestanden (siehe Abschnitt 1). Sagt NUR</w:t>
-      </w:r>
-    </w:p>
-    <w:p>
-      <w:pPr/>
-      <w:r>
-        <w:t>etwas über interne Konsistenz aus, nichts über reale Wirkung.</w:t>
+        <w:t xml:space="preserve"> - synthetische Tests bestanden (siehe Abschnitt 1). Sagt NUR etwas über interne Konsistenz aus, nichts über reale Wirkung.</w:t>
       </w:r>
     </w:p>
     <w:p>
@@ -141,13 +98,7 @@
         <w:t>Committet/gepusht</w:t>
       </w:r>
       <w:r>
-        <w:t xml:space="preserve"> - dauerhaft im Git-Verlauf, erreicht das Notebook nach</w:t>
-      </w:r>
-    </w:p>
-    <w:p>
-      <w:pPr/>
-      <w:r>
-        <w:t>einem Pull.</w:t>
+        <w:t xml:space="preserve"> - dauerhaft im Git-Verlauf, erreicht das Notebook nach einem Pull.</w:t>
       </w:r>
     </w:p>
     <w:p>
@@ -161,13 +112,7 @@
         <w:t>Deployed</w:t>
       </w:r>
       <w:r>
-        <w:t xml:space="preserve"> - Notebook hat gepullt und (falls nötig) neu gestartet, Code läuft</w:t>
-      </w:r>
-    </w:p>
-    <w:p>
-      <w:pPr/>
-      <w:r>
-        <w:t>tatsächlich.</w:t>
+        <w:t xml:space="preserve"> - Notebook hat gepullt und (falls nötig) neu gestartet, Code läuft tatsächlich.</w:t>
       </w:r>
     </w:p>
     <w:p>
@@ -181,37 +126,26 @@
         <w:t>Im Betrieb bestätigt</w:t>
       </w:r>
       <w:r>
-        <w:t xml:space="preserve"> - echte Signale sind gelaufen, das erwartete Verhalten</w:t>
+        <w:t xml:space="preserve"> - echte Signale sind gelaufen, das erwartete Verhalten wurde im Notebook-Export beobachtet (siehe Abschnitt 2).</w:t>
       </w:r>
     </w:p>
     <w:p>
-      <w:pPr/>
-      <w:r>
-        <w:t>wurde im Notebook-Export beobachtet (siehe Abschnitt 2).</w:t>
+      <w:pPr>
+        <w:jc w:val="left"/>
+      </w:pPr>
+      <w:r>
+        <w:t>Bei jeder Status-Angabe (in Chat, Regelwerksmanual, Memory) diese Stufe explizit nennen, nicht nur "erledigt" schreiben. Stufe 5 ist bei reinen LLM-Kontext-Änderungen (kein Gate, keine harte Regel) oft nicht sauber isolierbar - das ehrlich benennen, statt sich eine Wirkung einzureden (siehe Abschnitt 2.2, "Vorher-Hypothese").</w:t>
       </w:r>
     </w:p>
     <w:p>
-      <w:pPr/>
-      <w:r>
-        <w:t>Bei jeder Status-Angabe (in Chat, Regelwerksmanual, Memory) diese Stufe explizit</w:t>
-      </w:r>
-    </w:p>
-    <w:p>
-      <w:pPr/>
-      <w:r>
-        <w:t>nennen, nicht nur "erledigt" schreiben. Stufe 5 ist bei reinen LLM-Kontext-Änderungen</w:t>
-      </w:r>
-    </w:p>
-    <w:p>
-      <w:pPr/>
-      <w:r>
-        <w:t>(kein Gate, keine harte Regel) oft nicht sauber isolierbar - das ehrlich benennen,</w:t>
-      </w:r>
-    </w:p>
-    <w:p>
-      <w:pPr/>
-      <w:r>
-        <w:t>statt sich eine Wirkung einzureden (siehe Abschnitt 2.2, "Vorher-Hypothese").</w:t>
+      <w:pPr>
+        <w:spacing w:before="120"/>
+      </w:pPr>
+      <w:r>
+        <w:rPr>
+          <w:color w:val="AAAAAA"/>
+        </w:rPr>
+        <w:t>────────────────────────────────────────────────────────────</w:t>
       </w:r>
     </w:p>
     <w:p>
@@ -234,6 +168,7 @@
       <w:tblPr>
         <w:tblStyle w:val="LightGrid-Accent1"/>
         <w:tblW w:type="auto" w:w="0"/>
+        <w:jc w:val="left"/>
         <w:tblLook w:firstColumn="1" w:firstRow="1" w:lastColumn="0" w:lastRow="0" w:noHBand="0" w:noVBand="1" w:val="04A0"/>
       </w:tblPr>
       <w:tblGrid>
@@ -248,6 +183,14 @@
           </w:tcPr>
           <w:p>
             <w:r>
+              <w:rPr>
+                <w:b/>
+              </w:rPr>
+            </w:r>
+            <w:r>
+              <w:rPr>
+                <w:b/>
+              </w:rPr>
               <w:t>Klasse</w:t>
             </w:r>
           </w:p>
@@ -258,6 +201,14 @@
           </w:tcPr>
           <w:p>
             <w:r>
+              <w:rPr>
+                <w:b/>
+              </w:rPr>
+            </w:r>
+            <w:r>
+              <w:rPr>
+                <w:b/>
+              </w:rPr>
               <w:t>Beispiel</w:t>
             </w:r>
           </w:p>
@@ -268,6 +219,14 @@
           </w:tcPr>
           <w:p>
             <w:r>
+              <w:rPr>
+                <w:b/>
+              </w:rPr>
+            </w:r>
+            <w:r>
+              <w:rPr>
+                <w:b/>
+              </w:rPr>
               <w:t>Mindest-Standard</w:t>
             </w:r>
           </w:p>
@@ -279,8 +238,12 @@
             <w:tcW w:type="dxa" w:w="2880"/>
           </w:tcPr>
           <w:p>
+            <w:r/>
             <w:r>
-              <w:t>**1 — reiner Prompt-/Text-Fakt**</w:t>
+              <w:rPr>
+                <w:b/>
+              </w:rPr>
+              <w:t>1 — reiner Prompt-/Text-Fakt</w:t>
             </w:r>
           </w:p>
         </w:tc>
@@ -289,6 +252,7 @@
             <w:tcW w:type="dxa" w:w="2880"/>
           </w:tcPr>
           <w:p>
+            <w:r/>
             <w:r>
               <w:t>neue SYSTEM_PROMPT-Regel ohne neue Logik</w:t>
             </w:r>
@@ -299,8 +263,20 @@
             <w:tcW w:type="dxa" w:w="2880"/>
           </w:tcPr>
           <w:p>
+            <w:r/>
             <w:r>
-              <w:t>Modul-Import + `py_compile`-Check + Regelnummerierung/Schema-Konsistenz-Check (keine Lücke/Duplikat in den durchnummerierten Regeln, JSON-Schema-Kommentare zeigen auf die richtige Regelnummer)</w:t>
+              <w:t xml:space="preserve">Modul-Import + </w:t>
+            </w:r>
+            <w:r>
+              <w:rPr>
+                <w:rFonts w:ascii="Consolas" w:hAnsi="Consolas"/>
+                <w:color w:val="882222"/>
+                <w:sz w:val="18"/>
+              </w:rPr>
+              <w:t>py_compile</w:t>
+            </w:r>
+            <w:r>
+              <w:t>-Check + Regelnummerierung/Schema-Konsistenz-Check (keine Lücke/Duplikat in den durchnummerierten Regeln, JSON-Schema-Kommentare zeigen auf die richtige Regelnummer)</w:t>
             </w:r>
           </w:p>
         </w:tc>
@@ -311,8 +287,12 @@
             <w:tcW w:type="dxa" w:w="2880"/>
           </w:tcPr>
           <w:p>
+            <w:r/>
             <w:r>
-              <w:t>**2 — deterministische Logik**</w:t>
+              <w:rPr>
+                <w:b/>
+              </w:rPr>
+              <w:t>2 — deterministische Logik</w:t>
             </w:r>
           </w:p>
         </w:tc>
@@ -321,6 +301,7 @@
             <w:tcW w:type="dxa" w:w="2880"/>
           </w:tcPr>
           <w:p>
+            <w:r/>
             <w:r>
               <w:t>neue Gate-Formel, neue Schwelle, neue Risikofaktor-Berechnung</w:t>
             </w:r>
@@ -331,8 +312,20 @@
             <w:tcW w:type="dxa" w:w="2880"/>
           </w:tcPr>
           <w:p>
+            <w:r/>
             <w:r>
-              <w:t>Benannte Testfälle nach festem Muster (siehe 1.2), MINDESTENS: Regressionsfall (altes Verhalten unverändert), Positivfall (neue Logik greift korrekt), Grenzfall (Schwellenwert exakt getroffen, Nullwerte, `None`), Kombinationsfall (Zusammenspiel mit mindestens einem bestehenden Veto/Deckel)</w:t>
+              <w:t xml:space="preserve">Benannte Testfälle nach festem Muster (siehe 1.2), MINDESTENS: Regressionsfall (altes Verhalten unverändert), Positivfall (neue Logik greift korrekt), Grenzfall (Schwellenwert exakt getroffen, Nullwerte, </w:t>
+            </w:r>
+            <w:r>
+              <w:rPr>
+                <w:rFonts w:ascii="Consolas" w:hAnsi="Consolas"/>
+                <w:color w:val="882222"/>
+                <w:sz w:val="18"/>
+              </w:rPr>
+              <w:t>None</w:t>
+            </w:r>
+            <w:r>
+              <w:t>), Kombinationsfall (Zusammenspiel mit mindestens einem bestehenden Veto/Deckel)</w:t>
             </w:r>
           </w:p>
         </w:tc>
@@ -343,8 +336,12 @@
             <w:tcW w:type="dxa" w:w="2880"/>
           </w:tcPr>
           <w:p>
+            <w:r/>
             <w:r>
-              <w:t>**3 — DB-Schema**</w:t>
+              <w:rPr>
+                <w:b/>
+              </w:rPr>
+              <w:t>3 — DB-Schema</w:t>
             </w:r>
           </w:p>
         </w:tc>
@@ -353,6 +350,7 @@
             <w:tcW w:type="dxa" w:w="2880"/>
           </w:tcPr>
           <w:p>
+            <w:r/>
             <w:r>
               <w:t>neue Spalte/Tabelle, neue Migration</w:t>
             </w:r>
@@ -363,6 +361,7 @@
             <w:tcW w:type="dxa" w:w="2880"/>
           </w:tcPr>
           <w:p>
+            <w:r/>
             <w:r>
               <w:t>Zusätzlich zu Klasse 2: Migrations-Test (frische In-Memory-DB + Migration; zusätzlich eine "Alt-Zeile" ohne die neuen Spalten einfügen, Migration erneut laufen lassen - keine Exception, sinnvolle NULL-Defaults)</w:t>
             </w:r>
@@ -375,8 +374,12 @@
             <w:tcW w:type="dxa" w:w="2880"/>
           </w:tcPr>
           <w:p>
+            <w:r/>
             <w:r>
-              <w:t>**4 — UI-Änderung**</w:t>
+              <w:rPr>
+                <w:b/>
+              </w:rPr>
+              <w:t>4 — UI-Änderung</w:t>
             </w:r>
           </w:p>
         </w:tc>
@@ -385,6 +388,7 @@
             <w:tcW w:type="dxa" w:w="2880"/>
           </w:tcPr>
           <w:p>
+            <w:r/>
             <w:r>
               <w:t>neue Spalte/Dialog/Toggle</w:t>
             </w:r>
@@ -395,6 +399,7 @@
             <w:tcW w:type="dxa" w:w="2880"/>
           </w:tcPr>
           <w:p>
+            <w:r/>
             <w:r>
               <w:t>Zusätzlich zu Klasse 2 (falls Logik dahinter): Tk-Smoke-Test (Fenster öffnet ohne Exception, neues Element sichtbar, Interaktion löst erwartete Aktion aus)</w:t>
             </w:r>
@@ -402,22 +407,84 @@
         </w:tc>
       </w:tr>
     </w:tbl>
+    <w:p/>
     <w:p>
-      <w:pPr/>
-      <w:r>
-        <w:t>Faustregel: die Klasse richtet sich nach der RISKANTESTEN betroffenen Ebene, nicht</w:t>
+      <w:pPr>
+        <w:jc w:val="left"/>
+      </w:pPr>
+      <w:r>
+        <w:t>Faustregel: die Klasse richtet sich nach der RISKANTESTEN betroffenen Ebene, nicht nach der Summe. Eine Aenderung, die sowohl einen Prompt-Text als auch eine DB-Spalte betrifft, ist Klasse 3.</w:t>
       </w:r>
     </w:p>
     <w:p>
-      <w:pPr/>
-      <w:r>
-        <w:t>nach der Summe. Eine Aenderung, die sowohl einen Prompt-Text als auch eine DB-Spalte</w:t>
+      <w:pPr>
+        <w:pStyle w:val="Heading3"/>
+      </w:pPr>
+      <w:r>
+        <w:t>1.2 Format synthetischer Testfälle</w:t>
       </w:r>
     </w:p>
     <w:p>
-      <w:pPr/>
-      <w:r>
-        <w:t>betrifft, ist Klasse 3.</w:t>
+      <w:pPr>
+        <w:jc w:val="left"/>
+      </w:pPr>
+      <w:r>
+        <w:t>Wie bereits in dieser und vorherigen Sitzungen praktiziert (fortführen, nicht neu erfinden): In-Memory-SQLite (</w:t>
+      </w:r>
+      <w:r>
+        <w:rPr>
+          <w:rFonts w:ascii="Consolas" w:hAnsi="Consolas"/>
+          <w:color w:val="882222"/>
+          <w:sz w:val="18"/>
+        </w:rPr>
+        <w:t>sqlite3.connect(":memory:")</w:t>
+      </w:r>
+      <w:r>
+        <w:t xml:space="preserve">, </w:t>
+      </w:r>
+      <w:r>
+        <w:rPr>
+          <w:rFonts w:ascii="Consolas" w:hAnsi="Consolas"/>
+          <w:color w:val="882222"/>
+          <w:sz w:val="18"/>
+        </w:rPr>
+        <w:t>conn.row_factory = sqlite3.Row</w:t>
+      </w:r>
+      <w:r>
+        <w:t xml:space="preserve">, </w:t>
+      </w:r>
+      <w:r>
+        <w:rPr>
+          <w:rFonts w:ascii="Consolas" w:hAnsi="Consolas"/>
+          <w:color w:val="882222"/>
+          <w:sz w:val="18"/>
+        </w:rPr>
+        <w:t>database.db.init_db(conn)</w:t>
+      </w:r>
+      <w:r>
+        <w:t>), direkte Dataclass-Konstruktion (</w:t>
+      </w:r>
+      <w:r>
+        <w:rPr>
+          <w:rFonts w:ascii="Consolas" w:hAnsi="Consolas"/>
+          <w:color w:val="882222"/>
+          <w:sz w:val="18"/>
+        </w:rPr>
+        <w:t>Signal</w:t>
+      </w:r>
+      <w:r>
+        <w:t>/</w:t>
+      </w:r>
+      <w:r>
+        <w:rPr>
+          <w:rFonts w:ascii="Consolas" w:hAnsi="Consolas"/>
+          <w:color w:val="882222"/>
+          <w:sz w:val="18"/>
+        </w:rPr>
+        <w:t>HebelSignal</w:t>
+      </w:r>
+      <w:r>
+        <w:t xml:space="preserve"> mit nur den fuer den Testfall relevanten Feldern), benannte Fälle als T1, T2, T3... mit je einer Zeile Beschreibung, was geprüft wird und warum. KEIN Zugriff auf die Produktions-DB (siehe [[feedback_desktop_kein_produktivstart]] - gilt unveraendert).</w:t>
       </w:r>
     </w:p>
     <w:p>
@@ -425,608 +492,653 @@
         <w:pStyle w:val="Heading3"/>
       </w:pPr>
       <w:r>
-        <w:t>1.2 Format synthetischer Testfälle</w:t>
+        <w:t>1.3 Protokoll-Format (neu, ab jetzt verbindlich)</w:t>
       </w:r>
     </w:p>
     <w:p>
-      <w:pPr/>
-      <w:r>
-        <w:t>Wie bereits in dieser und vorherigen Sitzungen praktiziert (fortführen, nicht neu</w:t>
+      <w:pPr>
+        <w:jc w:val="left"/>
+      </w:pPr>
+      <w:r>
+        <w:t>Jeder Testlauf für Klasse 2-4 bekommt ein kurzes, einheitliches Ergebnis-Protokoll, das in die jeweilige Commit-Beschreibung bzw. den Regelwerksmanual-Nachtrag übernommen wird:</w:t>
       </w:r>
     </w:p>
     <w:p>
-      <w:pPr/>
-      <w:r>
-        <w:t>erfinden): In-Memory-SQLite (</w:t>
-      </w:r>
+      <w:pPr>
+        <w:spacing w:after="120"/>
+        <w:ind w:left="360"/>
+      </w:pPr>
       <w:r>
         <w:rPr>
           <w:rFonts w:ascii="Consolas" w:hAnsi="Consolas"/>
+          <w:sz w:val="17"/>
         </w:rPr>
-        <w:t>sqlite3.connect(":memory:")</w:t>
-      </w:r>
-      <w:r>
-        <w:t>, `conn.row_factory =</w:t>
+        <w:t>Verifikation [Datum]:</w:t>
+        <w:br/>
+        <w:t xml:space="preserve">  Betroffene Datei(en): ...</w:t>
+        <w:br/>
+        <w:t xml:space="preserve">  Änderungsklasse: 1/2/3/4</w:t>
+        <w:br/>
+        <w:t xml:space="preserve">  Testfälle: T1 &lt;Kurzbeschreibung&gt; - PASS/FAIL</w:t>
+        <w:br/>
+        <w:t xml:space="preserve">             T2 ... - PASS/FAIL</w:t>
+        <w:br/>
+        <w:t xml:space="preserve">             ...</w:t>
+        <w:br/>
+        <w:t xml:space="preserve">  Regressionscheck (Imports aller betroffenen Module): PASS/FAIL</w:t>
+        <w:br/>
+        <w:t xml:space="preserve">  Gesamturteil: verifiziert (Stufe 2) / nicht bestanden (Ursache: ...)</w:t>
       </w:r>
     </w:p>
     <w:p>
-      <w:pPr/>
-      <w:r>
-        <w:t>sqlite3.Row</w:t>
-      </w:r>
-      <w:r>
-        <w:rPr>
-          <w:rFonts w:ascii="Consolas" w:hAnsi="Consolas"/>
-        </w:rPr>
-        <w:t xml:space="preserve">, </w:t>
-      </w:r>
-      <w:r>
-        <w:t>database.db.init_db(conn)`), direkte Dataclass-Konstruktion</w:t>
+      <w:pPr>
+        <w:jc w:val="left"/>
+      </w:pPr>
+      <w:r>
+        <w:t>Für Klasse 1 genügt eine Kurzfassung ("Modul-Import OK, Regelnummerierung 1-N ohne Lücke, Compile-Check OK").</w:t>
       </w:r>
     </w:p>
     <w:p>
-      <w:pPr/>
-      <w:r>
-        <w:t>(</w:t>
-      </w:r>
-      <w:r>
-        <w:rPr>
-          <w:rFonts w:ascii="Consolas" w:hAnsi="Consolas"/>
-        </w:rPr>
-        <w:t>Signal</w:t>
-      </w:r>
-      <w:r>
-        <w:t>/</w:t>
-      </w:r>
-      <w:r>
-        <w:rPr>
-          <w:rFonts w:ascii="Consolas" w:hAnsi="Consolas"/>
-        </w:rPr>
-        <w:t>HebelSignal</w:t>
-      </w:r>
-      <w:r>
-        <w:t xml:space="preserve"> mit nur den fuer den Testfall relevanten Feldern), benannte</w:t>
+      <w:pPr>
+        <w:pStyle w:val="Heading3"/>
+      </w:pPr>
+      <w:r>
+        <w:t>1.4 Lücke gefunden und geschlossen (2026-07-31): `py_compile`/`ast.parse` reicht NICHT für Funktionsumbenennungen</w:t>
       </w:r>
     </w:p>
     <w:p>
-      <w:pPr/>
-      <w:r>
-        <w:t>Fälle als T1, T2, T3... mit je einer Zeile Beschreibung, was geprüft wird und warum.</w:t>
-      </w:r>
-    </w:p>
-    <w:p>
-      <w:pPr/>
-      <w:r>
-        <w:t>KEIN Zugriff auf die Produktions-DB (siehe</w:t>
-      </w:r>
-    </w:p>
-    <w:p>
-      <w:pPr/>
-      <w:r>
-        <w:t>[[feedback_desktop_kein_produktivstart]] - gilt unveraendert).</w:t>
-      </w:r>
-    </w:p>
-    <w:p>
-      <w:pPr>
-        <w:pStyle w:val="Heading3"/>
-      </w:pPr>
-      <w:r>
-        <w:t>1.3 Protokoll-Format (neu, ab jetzt verbindlich)</w:t>
-      </w:r>
-    </w:p>
-    <w:p>
-      <w:pPr/>
-      <w:r>
-        <w:t>Jeder Testlauf für Klasse 2-4 bekommt ein kurzes, einheitliches Ergebnis-Protokoll,</w:t>
-      </w:r>
-    </w:p>
-    <w:p>
-      <w:pPr/>
-      <w:r>
-        <w:t>das in die jeweilige Commit-Beschreibung bzw. den Regelwerksmanual-Nachtrag</w:t>
-      </w:r>
-    </w:p>
-    <w:p>
-      <w:pPr/>
-      <w:r>
-        <w:t>übernommen wird:</w:t>
-      </w:r>
-    </w:p>
-    <w:p>
-      <w:pPr/>
-      <w:r>
-        <w:rPr>
-          <w:rFonts w:ascii="Consolas" w:hAnsi="Consolas"/>
-        </w:rPr>
-        <w:t>`</w:t>
-      </w:r>
-    </w:p>
-    <w:p>
-      <w:pPr/>
-      <w:r>
-        <w:t>Verifikation [Datum]:</w:t>
-      </w:r>
-    </w:p>
-    <w:p>
-      <w:pPr/>
-      <w:r>
-        <w:t>Betroffene Datei(en): ...</w:t>
-      </w:r>
-    </w:p>
-    <w:p>
-      <w:pPr/>
-      <w:r>
-        <w:t>Änderungsklasse: 1/2/3/4</w:t>
-      </w:r>
-    </w:p>
-    <w:p>
-      <w:pPr/>
-      <w:r>
-        <w:t>Testfälle: T1 &lt;Kurzbeschreibung&gt; - PASS/FAIL</w:t>
-      </w:r>
-    </w:p>
-    <w:p>
-      <w:pPr/>
-      <w:r>
-        <w:t>T2 ... - PASS/FAIL</w:t>
-      </w:r>
-    </w:p>
-    <w:p>
-      <w:pPr/>
-      <w:r>
-        <w:t>...</w:t>
-      </w:r>
-    </w:p>
-    <w:p>
-      <w:pPr/>
-      <w:r>
-        <w:t>Regressionscheck (Imports aller betroffenen Module): PASS/FAIL</w:t>
-      </w:r>
-    </w:p>
-    <w:p>
-      <w:pPr/>
-      <w:r>
-        <w:t>Gesamturteil: verifiziert (Stufe 2) / nicht bestanden (Ursache: ...)</w:t>
-      </w:r>
-    </w:p>
-    <w:p>
-      <w:pPr/>
-      <w:r>
-        <w:rPr>
-          <w:rFonts w:ascii="Consolas" w:hAnsi="Consolas"/>
-        </w:rPr>
-        <w:t>`</w:t>
-      </w:r>
-    </w:p>
-    <w:p>
-      <w:pPr/>
-      <w:r>
-        <w:t>Für Klasse 1 genügt eine Kurzfassung ("Modul-Import OK, Regelnummerierung 1-N ohne</w:t>
-      </w:r>
-    </w:p>
-    <w:p>
-      <w:pPr/>
-      <w:r>
-        <w:t>Lücke, Compile-Check OK").</w:t>
-      </w:r>
-    </w:p>
-    <w:p>
-      <w:pPr>
-        <w:pStyle w:val="Heading3"/>
-      </w:pPr>
-      <w:r>
-        <w:t>1.4 Lücke gefunden und geschlossen (2026-07-31): py_compile/ast.parse reicht NICHT für Funktionsumbenennungen</w:t>
-      </w:r>
-    </w:p>
-    <w:p>
-      <w:pPr/>
-      <w:r>
-        <w:t>Auslöser: nach dem Selbst-Halten-Schatten-Feature (siehe Regelwerksmanual-Nachtrag) lief extract_notebook_diagnose.py am Notebook mit NameError: name '_richtung_aus_veto_zonen' is not defined. Die Funktion war im selben Commit zu _richtung_aus_zonen() umbenannt worden - python -m py_compile UND ein reiner ast.parse()-Check waren beide grün, weil beide nur Syntax prüfen, nicht ob ein referenzierter Name zur Laufzeit existiert. Der verbliebene Aufruf lag in compute_zai_richtung_performance_schatten() - einer bereits BESTEHENDEN Funktion (28.07.), die beim Umbenennen nicht als Aufrufer erkannt wurde, weil sie nicht Teil des aktuell bearbeiteten Funktions-Sets war.</w:t>
-      </w:r>
-    </w:p>
-    <w:p>
-      <w:pPr/>
-      <w:r>
-        <w:t>Lehre 1 - bei jeder Funktions-/Symbol-Umbenennung: grep -rn "&lt;alter_name&gt;" über das GESAMTE Repository (nicht nur die Datei, die gerade bearbeitet wird) VOR dem Abschluss der Änderung, nicht danach. Ein "einziger Aufrufer" ist eine Annahme, keine verifizierte Tatsache, bis der Grep sie bestätigt hat.</w:t>
-      </w:r>
-    </w:p>
-    <w:p>
-      <w:pPr/>
-      <w:r>
-        <w:t>Lehre 2 - py_compile/ast.parse deckt nur Syntaxfehler ab, keine Laufzeit-Namensauflösung. Ein NameError in einer Funktion, die im Testlauf nie AUFGERUFEN wird, bleibt für beide Checks unsichtbar. Für Skripte mit einem klaren Einstiegspunkt (extract_notebook_diagnose.py::main(), ähnliche Batch-/Export-Skripte) gehört ab jetzt zur Klasse-2/3-Mindesttiefe zusätzlich ein End-to-End-Smoke-Test des Einstiegspunkts gegen eine frische temp-SQLite-Datei (DB_PATH umgebogen, NIE Produktiv-DB) - nicht nur ein Test der einzelnen neu geschriebenen Funktionen. Der reine import-Test allein reicht ebenfalls nicht (Python löst Namen erst bei Funktionsaufruf auf, nicht beim Modul-Import).</w:t>
-      </w:r>
-    </w:p>
-    <w:p>
-      <w:pPr>
-        <w:pStyle w:val="Heading2"/>
-      </w:pPr>
-      <w:r>
-        <w:t>2. Notebook-Export-Analyse-Standard (Realitätscheck + Lerneffekt)</w:t>
-      </w:r>
-    </w:p>
-    <w:p>
-      <w:pPr>
-        <w:pStyle w:val="Heading3"/>
-      </w:pPr>
-      <w:r>
-        <w:t>2.1 Fester Kennzahlen-Katalog (bei JEDEM neuen Export durchgehen, nicht nur die gerade interessierende Frage)</w:t>
-      </w:r>
-    </w:p>
-    <w:p>
-      <w:pPr>
-        <w:pStyle w:val="ListNumber"/>
-      </w:pPr>
-      <w:r>
-        <w:t>LLM-Budget/Calls heute je Provider (</w:t>
-      </w:r>
-      <w:r>
-        <w:rPr>
-          <w:rFonts w:ascii="Consolas" w:hAnsi="Consolas"/>
-        </w:rPr>
-        <w:t>llm_calls_heute</w:t>
-      </w:r>
-      <w:r>
-        <w:t>)</w:t>
-      </w:r>
-    </w:p>
-    <w:p>
-      <w:pPr>
-        <w:pStyle w:val="ListNumber"/>
-      </w:pPr>
-      <w:r>
-        <w:t>Signal-Volumen je Pipeline (</w:t>
-      </w:r>
-      <w:r>
-        <w:rPr>
-          <w:rFonts w:ascii="Consolas" w:hAnsi="Consolas"/>
-        </w:rPr>
-        <w:t>signal_volumen_heute</w:t>
-      </w:r>
-      <w:r>
-        <w:t>)</w:t>
-      </w:r>
-    </w:p>
-    <w:p>
-      <w:pPr>
-        <w:pStyle w:val="ListNumber"/>
-      </w:pPr>
-      <w:r>
-        <w:t>Provider-Performance (Win-Rate/Ø realisiertes CRV) je Assetklasse</w:t>
-      </w:r>
-    </w:p>
-    <w:p>
-      <w:pPr/>
-      <w:r>
-        <w:t>(</w:t>
-      </w:r>
-      <w:r>
-        <w:rPr>
-          <w:rFonts w:ascii="Consolas" w:hAnsi="Consolas"/>
-        </w:rPr>
-        <w:t>provider_performance</w:t>
-      </w:r>
-      <w:r>
-        <w:t>)</w:t>
-      </w:r>
-    </w:p>
-    <w:p>
-      <w:pPr>
-        <w:pStyle w:val="ListNumber"/>
-      </w:pPr>
-      <w:r>
-        <w:t>Konfidenz-Kalibrierung je Band (</w:t>
-      </w:r>
-      <w:r>
-        <w:rPr>
-          <w:rFonts w:ascii="Consolas" w:hAnsi="Consolas"/>
-        </w:rPr>
-        <w:t>konfidenz_kalibrierung</w:t>
-      </w:r>
-      <w:r>
-        <w:t>)</w:t>
-      </w:r>
-    </w:p>
-    <w:p>
-      <w:pPr>
-        <w:pStyle w:val="ListNumber"/>
-      </w:pPr>
-      <w:r>
-        <w:t>Z.ai-Richtungs-/Konsistenz-Abgleich (</w:t>
-      </w:r>
-      <w:r>
-        <w:rPr>
-          <w:rFonts w:ascii="Consolas" w:hAnsi="Consolas"/>
-        </w:rPr>
-        <w:t>zai_gegenpruefung_verlauf</w:t>
-      </w:r>
-      <w:r>
-        <w:t>,</w:t>
-      </w:r>
-    </w:p>
-    <w:p>
-      <w:pPr/>
-      <w:r>
-        <w:rPr>
-          <w:rFonts w:ascii="Consolas" w:hAnsi="Consolas"/>
-        </w:rPr>
-        <w:t>zai_richtung_performance</w:t>
-      </w:r>
-      <w:r>
-        <w:t>)</w:t>
-      </w:r>
-    </w:p>
-    <w:p>
-      <w:pPr>
-        <w:pStyle w:val="ListNumber"/>
-      </w:pPr>
-      <w:r>
-        <w:t>Gate-Veto-Häufigkeit - insbesondere NEUE oder sich häufende Muster</w:t>
-      </w:r>
-    </w:p>
-    <w:p>
-      <w:pPr/>
-      <w:r>
-        <w:t>(</w:t>
-      </w:r>
-      <w:r>
-        <w:rPr>
-          <w:rFonts w:ascii="Consolas" w:hAnsi="Consolas"/>
-        </w:rPr>
-        <w:t>gate_veto_haeufigkeit</w:t>
-      </w:r>
-      <w:r>
-        <w:t>)</w:t>
-      </w:r>
-    </w:p>
-    <w:p>
-      <w:pPr>
-        <w:pStyle w:val="ListNumber"/>
-      </w:pPr>
-      <w:r>
-        <w:t>App-Neustart-Häufigkeit / Log-Auffälligkeiten (</w:t>
-      </w:r>
-      <w:r>
-        <w:rPr>
-          <w:rFonts w:ascii="Consolas" w:hAnsi="Consolas"/>
-        </w:rPr>
-        <w:t>log_auszug</w:t>
-      </w:r>
-      <w:r>
-        <w:t xml:space="preserve"> auf</w:t>
-      </w:r>
-    </w:p>
-    <w:p>
-      <w:pPr/>
-      <w:r>
-        <w:t>"Added job"/"Traceback"/"CRITICAL" durchsuchen)</w:t>
-      </w:r>
-    </w:p>
-    <w:p>
-      <w:pPr>
-        <w:pStyle w:val="ListNumber"/>
-      </w:pPr>
-      <w:r>
-        <w:t>Wartezeit bis Auflösung je Outcome-Status (Median/Mittelwert, getrennt nach</w:t>
-      </w:r>
-    </w:p>
-    <w:p>
-      <w:pPr>
-        <w:pStyle w:val="ListNumber"/>
-      </w:pPr>
-      <w:r>
-        <w:t>Stop-Loss-MFE-Analyse (</w:t>
-      </w:r>
-      <w:r>
-        <w:rPr>
-          <w:rFonts w:ascii="Consolas" w:hAnsi="Consolas"/>
-        </w:rPr>
-        <w:t>compute_sl_mfe_analyse()</w:t>
-      </w:r>
-      <w:r>
-        <w:t>) - Quote der SL-Faelle mit zwischenzeitlich positivem MFE trotz spaetem Stop (siehe Abschnitt 2.6)</w:t>
-      </w:r>
-    </w:p>
-    <w:p>
-      <w:pPr/>
-      <w:r>
-        <w:t>gleichem Kalendertag wie Erstellung vs. späterem Tag - siehe</w:t>
-      </w:r>
-    </w:p>
-    <w:p>
-      <w:pPr/>
-      <w:r>
-        <w:t>[[project_zai_gegenpruefungslogik]] für die Methodik, warum diese Trennung</w:t>
-      </w:r>
-    </w:p>
-    <w:p>
-      <w:pPr/>
-      <w:r>
-        <w:t>nötig ist)</w:t>
-      </w:r>
-    </w:p>
-    <w:p>
-      <w:pPr/>
-      <w:r>
-        <w:t>Diese acht Punkte werden IMMER kurz durchgegangen, auch wenn der Anlass für den</w:t>
-      </w:r>
-    </w:p>
-    <w:p>
-      <w:pPr/>
-      <w:r>
-        <w:t>Export etwas anderes war - Auffälligkeiten ausserhalb der eigentlichen Fragestellung</w:t>
-      </w:r>
-    </w:p>
-    <w:p>
-      <w:pPr/>
-      <w:r>
-        <w:t>nicht ignorieren (siehe z.B. den ISOC/X136-Ticker-Fund, der nebenbei beim</w:t>
-      </w:r>
-    </w:p>
-    <w:p>
-      <w:pPr/>
-      <w:r>
-        <w:t>Durchgehen von Punkt 6 auffiel).</w:t>
-      </w:r>
-    </w:p>
-    <w:p>
-      <w:pPr>
-        <w:pStyle w:val="Heading3"/>
-      </w:pPr>
-      <w:r>
-        <w:t>2.1a Export-Vollständigkeits-Check vor jeder NEUEN Fragestellung (verbindlich)</w:t>
-      </w:r>
-    </w:p>
-    <w:p>
-      <w:pPr/>
+      <w:pPr>
+        <w:jc w:val="left"/>
+      </w:pPr>
       <w:r>
         <w:rPr>
           <w:b/>
         </w:rPr>
-        <w:t xml:space="preserve">Auslöser: </w:t>
-      </w:r>
-      <w:r>
-        <w:t xml:space="preserve">wiederholt aufgetreten (29.07. Konfidenz-CRV/SL-Korrelation, 30.07. Z.ai-6-Pipelines-Assetklassen-Zuordnung, 30.07. ATR-Perzentil-Veraltungs-Check) - bevor eine Frage beantwortet wird, die NICHT bereits vom festen Kennzahlen-Katalog (2.1) abgedeckt ist, aktiv prüfen, ob </w:t>
+        <w:t>Auslöser:</w:t>
+      </w:r>
+      <w:r>
+        <w:t xml:space="preserve"> nach dem Selbst-Halten-Schatten-Feature (siehe Regelwerksmanual- Nachtrag) lief </w:t>
       </w:r>
       <w:r>
         <w:rPr>
           <w:rFonts w:ascii="Consolas" w:hAnsi="Consolas"/>
+          <w:color w:val="882222"/>
+          <w:sz w:val="18"/>
         </w:rPr>
         <w:t>extract_notebook_diagnose.py</w:t>
       </w:r>
       <w:r>
-        <w:t xml:space="preserve"> die dafür nötigen Rohdaten überhaupt exportiert - nicht stillschweigend mit vorhandenen, aber eigentlich unpassenden Daten behelfen oder die Frage unbeantwortet lassen.</w:t>
+        <w:t xml:space="preserve"> am Notebook mit </w:t>
+      </w:r>
+      <w:r>
+        <w:rPr>
+          <w:rFonts w:ascii="Consolas" w:hAnsi="Consolas"/>
+          <w:color w:val="882222"/>
+          <w:sz w:val="18"/>
+        </w:rPr>
+        <w:t>NameError: name '_richtung_aus_veto_zonen' is not defined</w:t>
+      </w:r>
+      <w:r>
+        <w:t xml:space="preserve">. Die Funktion war im selben Commit zu </w:t>
+      </w:r>
+      <w:r>
+        <w:rPr>
+          <w:rFonts w:ascii="Consolas" w:hAnsi="Consolas"/>
+          <w:color w:val="882222"/>
+          <w:sz w:val="18"/>
+        </w:rPr>
+        <w:t>_richtung_aus_zonen()</w:t>
+      </w:r>
+      <w:r>
+        <w:t xml:space="preserve"> umbenannt worden - </w:t>
+      </w:r>
+      <w:r>
+        <w:rPr>
+          <w:rFonts w:ascii="Consolas" w:hAnsi="Consolas"/>
+          <w:color w:val="882222"/>
+          <w:sz w:val="18"/>
+        </w:rPr>
+        <w:t>python -m py_compile</w:t>
+      </w:r>
+      <w:r>
+        <w:t xml:space="preserve"> UND ein reiner </w:t>
+      </w:r>
+      <w:r>
+        <w:rPr>
+          <w:rFonts w:ascii="Consolas" w:hAnsi="Consolas"/>
+          <w:color w:val="882222"/>
+          <w:sz w:val="18"/>
+        </w:rPr>
+        <w:t>ast.parse()</w:t>
+      </w:r>
+      <w:r>
+        <w:t xml:space="preserve">-Check waren beide grün, weil beide nur Syntax prüfen, nicht ob ein referenzierter Name zur Laufzeit existiert. Der verbliebene Aufruf lag in </w:t>
+      </w:r>
+      <w:r>
+        <w:rPr>
+          <w:rFonts w:ascii="Consolas" w:hAnsi="Consolas"/>
+          <w:color w:val="882222"/>
+          <w:sz w:val="18"/>
+        </w:rPr>
+        <w:t>compute_zai_richtung_performance_schatten()</w:t>
+      </w:r>
+      <w:r>
+        <w:t xml:space="preserve"> - einer bereits BESTEHENDEN Funktion (28.07.), die beim Umbenennen nicht als Aufrufer erkannt wurde, weil sie nicht Teil des aktuell bearbeiteten Funktions-Sets war.</w:t>
       </w:r>
     </w:p>
     <w:p>
-      <w:pPr/>
+      <w:pPr>
+        <w:jc w:val="left"/>
+      </w:pPr>
       <w:r>
         <w:rPr>
           <w:b/>
         </w:rPr>
-        <w:t xml:space="preserve">Vorgehen: </w:t>
+        <w:t>Lehre 1 - bei jeder Funktions-/Symbol-Umbenennung:</w:t>
+      </w:r>
+      <w:r>
+        <w:t xml:space="preserve"> </w:t>
+      </w:r>
+      <w:r>
+        <w:rPr>
+          <w:rFonts w:ascii="Consolas" w:hAnsi="Consolas"/>
+          <w:color w:val="882222"/>
+          <w:sz w:val="18"/>
+        </w:rPr>
+        <w:t>grep -rn "&lt;alter_name&gt;"</w:t>
+      </w:r>
+      <w:r>
+        <w:t xml:space="preserve"> über das GESAMTE Repository (nicht nur die Datei, die gerade bearbeitet wird) VOR dem Abschluss der Änderung, nicht danach. Ein "einziger Aufrufer" ist eine Annahme, keine verifizierte Tatsache, bis der Grep sie bestätigt hat.</w:t>
       </w:r>
     </w:p>
     <w:p>
-      <w:pPr/>
-      <w:r>
-        <w:t>1. Export-Top-Level-Keys durchsehen (</w:t>
-      </w:r>
-      <w:r>
-        <w:rPr>
-          <w:rFonts w:ascii="Consolas" w:hAnsi="Consolas"/>
-        </w:rPr>
-        <w:t>data.keys()</w:t>
-      </w:r>
-      <w:r>
-        <w:t>) - existiert bereits eine passende Sektion?</w:t>
-      </w:r>
-    </w:p>
-    <w:p>
-      <w:pPr/>
-      <w:r>
-        <w:t>2. Falls eine verwandte, aber zu enge Sektion existiert (z.B. eine Preishistorie nur für eine Teilmenge Symbole): prüfen, ob sie für die konkrete Frage ausreicht, oder ob sie strukturell den falschen Ausschnitt liefert.</w:t>
-      </w:r>
-    </w:p>
-    <w:p>
-      <w:pPr/>
-      <w:r>
-        <w:t xml:space="preserve">3. Falls nötig: eine neue, MINIMALE Export-Funktion nach dem etablierten Muster ergänzen (eigene </w:t>
-      </w:r>
-      <w:r>
-        <w:rPr>
-          <w:rFonts w:ascii="Consolas" w:hAnsi="Consolas"/>
-        </w:rPr>
-        <w:t>_xxx(conn) -&gt; dict</w:t>
-      </w:r>
-      <w:r>
-        <w:t xml:space="preserve">-Funktion, reine Lesefunktion/Aggregation, in </w:t>
-      </w:r>
-      <w:r>
-        <w:rPr>
-          <w:rFonts w:ascii="Consolas" w:hAnsi="Consolas"/>
-        </w:rPr>
-        <w:t>main()</w:t>
-      </w:r>
-      <w:r>
-        <w:t xml:space="preserve"> eingehängt) - keine Sonderlösung nur für diese eine Frage, sondern eine wiederverwendbare Sektion (siehe z.B. </w:t>
-      </w:r>
-      <w:r>
-        <w:rPr>
-          <w:rFonts w:ascii="Consolas" w:hAnsi="Consolas"/>
-        </w:rPr>
-        <w:t>_preishistorie_ueberholte_symbole()</w:t>
-      </w:r>
-      <w:r>
-        <w:t xml:space="preserve">, </w:t>
-      </w:r>
-      <w:r>
-        <w:rPr>
-          <w:rFonts w:ascii="Consolas" w:hAnsi="Consolas"/>
-        </w:rPr>
-        <w:t>_deribit_cross_check_verlauf()</w:t>
-      </w:r>
-      <w:r>
-        <w:t xml:space="preserve"> als Referenzmuster).</w:t>
-      </w:r>
-    </w:p>
-    <w:p>
-      <w:pPr/>
-      <w:r>
-        <w:t>4. Skript-Änderung dem Nutzer explizit zur Bestätigung vorlegen, dann am Notebook laufen lassen + zurücksynchronisieren lassen, bevor die eigentliche Analyse fortgesetzt wird.</w:t>
-      </w:r>
-    </w:p>
-    <w:p>
-      <w:pPr/>
+      <w:pPr>
+        <w:jc w:val="left"/>
+      </w:pPr>
       <w:r>
         <w:rPr>
           <w:b/>
         </w:rPr>
-        <w:t xml:space="preserve">Bewusst NICHT: </w:t>
-      </w:r>
-      <w:r>
-        <w:t>aus fehlenden Daten eine Vermutung machen und diese als Befund ausgeben - fehlende Exportabdeckung ist ein Blocker für die Fragestellung, kein Grund für eine ungeprüfte Annahme.</w:t>
+        <w:t>Lehre 2 - `py_compile`/`ast.parse` deckt nur Syntaxfehler ab, keine Laufzeit-Namensauflösung.</w:t>
+      </w:r>
+      <w:r>
+        <w:t xml:space="preserve"> Ein </w:t>
+      </w:r>
+      <w:r>
+        <w:rPr>
+          <w:rFonts w:ascii="Consolas" w:hAnsi="Consolas"/>
+          <w:color w:val="882222"/>
+          <w:sz w:val="18"/>
+        </w:rPr>
+        <w:t>NameError</w:t>
+      </w:r>
+      <w:r>
+        <w:t xml:space="preserve"> in einer Funktion, die im Testlauf nie AUFGERUFEN wird, bleibt für beide Checks unsichtbar. Für Skripte mit einem klaren Einstiegspunkt (</w:t>
+      </w:r>
+      <w:r>
+        <w:rPr>
+          <w:rFonts w:ascii="Consolas" w:hAnsi="Consolas"/>
+          <w:color w:val="882222"/>
+          <w:sz w:val="18"/>
+        </w:rPr>
+        <w:t>extract_notebook_diagnose.py:: main()</w:t>
+      </w:r>
+      <w:r>
+        <w:t xml:space="preserve">, ähnliche Batch-/Export-Skripte) gehört ab jetzt zur Klasse-2/3- Mindesttiefe zusätzlich ein </w:t>
+      </w:r>
+      <w:r>
+        <w:rPr>
+          <w:b/>
+        </w:rPr>
+        <w:t>End-to-End-Smoke-Test des Einstiegspunkts</w:t>
+      </w:r>
+      <w:r>
+        <w:t xml:space="preserve"> gegen eine frische temp-SQLite-Datei (DB_PATH umgebogen, NIE Produktiv-DB, siehe [[feedback_desktop_kein_produktivstart]]) - nicht nur ein Test der einzelnen neu geschriebenen Funktionen. Der reine </w:t>
+      </w:r>
+      <w:r>
+        <w:rPr>
+          <w:rFonts w:ascii="Consolas" w:hAnsi="Consolas"/>
+          <w:color w:val="882222"/>
+          <w:sz w:val="18"/>
+        </w:rPr>
+        <w:t>import</w:t>
+      </w:r>
+      <w:r>
+        <w:t>-Test allein reicht ebenfalls nicht (Python löst Namen erst bei Funktionsaufruf auf, nicht beim Modul-Import).</w:t>
       </w:r>
     </w:p>
     <w:p>
       <w:pPr>
-        <w:pStyle w:val="Heading3"/>
-      </w:pPr>
-      <w:r>
-        <w:t>2.2 Vorher-Hypothese (Lerneffekt-Kern)</w:t>
+        <w:spacing w:before="120"/>
+      </w:pPr>
+      <w:r>
+        <w:rPr>
+          <w:color w:val="AAAAAA"/>
+        </w:rPr>
+        <w:t>────────────────────────────────────────────────────────────</w:t>
       </w:r>
     </w:p>
     <w:p>
-      <w:pPr/>
-      <w:r>
-        <w:t>Bei jeder Änderung, deren Wirkung im Betrieb beobachtet werden soll: VOR dem</w:t>
+      <w:pPr>
+        <w:pStyle w:val="Heading2"/>
+      </w:pPr>
+      <w:r>
+        <w:t>2. Notebook-Export-Analyse-Standard (Realitätscheck + Lerneffekt)</w:t>
       </w:r>
     </w:p>
     <w:p>
-      <w:pPr/>
-      <w:r>
-        <w:t>nächsten Export kurz notieren (in der jeweiligen Memory-Datei oder im</w:t>
+      <w:pPr>
+        <w:pStyle w:val="Heading3"/>
+      </w:pPr>
+      <w:r>
+        <w:t>2.1 Fester Kennzahlen-Katalog (bei JEDEM neuen Export durchgehen, nicht nur die gerade interessierende Frage)</w:t>
       </w:r>
     </w:p>
     <w:p>
-      <w:pPr/>
-      <w:r>
-        <w:t>Regelwerksmanual-Nachtrag), WAS konkret erwartet wird. Beim nächsten Export dann</w:t>
+      <w:pPr>
+        <w:pStyle w:val="ListNumber"/>
+      </w:pPr>
+      <w:r>
+        <w:t>LLM-Budget/Calls heute je Provider (</w:t>
+      </w:r>
+      <w:r>
+        <w:rPr>
+          <w:rFonts w:ascii="Consolas" w:hAnsi="Consolas"/>
+          <w:color w:val="882222"/>
+          <w:sz w:val="18"/>
+        </w:rPr>
+        <w:t>llm_calls_heute</w:t>
+      </w:r>
+      <w:r>
+        <w:t>)</w:t>
       </w:r>
     </w:p>
     <w:p>
-      <w:pPr/>
-      <w:r>
-        <w:t>ehrlich prüfen, ob das eingetreten ist - nicht die Beobachtung nachträglich passend</w:t>
+      <w:pPr>
+        <w:pStyle w:val="ListNumber"/>
+      </w:pPr>
+      <w:r>
+        <w:t>Signal-Volumen je Pipeline (</w:t>
+      </w:r>
+      <w:r>
+        <w:rPr>
+          <w:rFonts w:ascii="Consolas" w:hAnsi="Consolas"/>
+          <w:color w:val="882222"/>
+          <w:sz w:val="18"/>
+        </w:rPr>
+        <w:t>signal_volumen_heute</w:t>
+      </w:r>
+      <w:r>
+        <w:t>)</w:t>
       </w:r>
     </w:p>
     <w:p>
-      <w:pPr/>
-      <w:r>
-        <w:t>interpretieren.</w:t>
+      <w:pPr>
+        <w:pStyle w:val="ListNumber"/>
+      </w:pPr>
+      <w:r>
+        <w:t>Provider-Performance (Win-Rate/Ø realisiertes CRV) je Assetklasse (</w:t>
+      </w:r>
+      <w:r>
+        <w:rPr>
+          <w:rFonts w:ascii="Consolas" w:hAnsi="Consolas"/>
+          <w:color w:val="882222"/>
+          <w:sz w:val="18"/>
+        </w:rPr>
+        <w:t>provider_performance</w:t>
+      </w:r>
+      <w:r>
+        <w:t>)</w:t>
       </w:r>
     </w:p>
     <w:p>
-      <w:pPr/>
+      <w:pPr>
+        <w:pStyle w:val="ListNumber"/>
+      </w:pPr>
+      <w:r>
+        <w:t>Konfidenz-Kalibrierung je Band (</w:t>
+      </w:r>
+      <w:r>
+        <w:rPr>
+          <w:rFonts w:ascii="Consolas" w:hAnsi="Consolas"/>
+          <w:color w:val="882222"/>
+          <w:sz w:val="18"/>
+        </w:rPr>
+        <w:t>konfidenz_kalibrierung</w:t>
+      </w:r>
+      <w:r>
+        <w:t>)</w:t>
+      </w:r>
+    </w:p>
+    <w:p>
+      <w:pPr>
+        <w:pStyle w:val="ListNumber"/>
+      </w:pPr>
+      <w:r>
+        <w:t>Z.ai-Richtungs-/Konsistenz-Abgleich (</w:t>
+      </w:r>
+      <w:r>
+        <w:rPr>
+          <w:rFonts w:ascii="Consolas" w:hAnsi="Consolas"/>
+          <w:color w:val="882222"/>
+          <w:sz w:val="18"/>
+        </w:rPr>
+        <w:t>zai_gegenpruefung_verlauf</w:t>
+      </w:r>
+      <w:r>
+        <w:t xml:space="preserve">, </w:t>
+      </w:r>
+      <w:r>
+        <w:rPr>
+          <w:rFonts w:ascii="Consolas" w:hAnsi="Consolas"/>
+          <w:color w:val="882222"/>
+          <w:sz w:val="18"/>
+        </w:rPr>
+        <w:t>zai_richtung_performance</w:t>
+      </w:r>
+      <w:r>
+        <w:t>)</w:t>
+      </w:r>
+    </w:p>
+    <w:p>
+      <w:pPr>
+        <w:pStyle w:val="ListNumber"/>
+      </w:pPr>
+      <w:r>
+        <w:t>Gate-Veto-Häufigkeit - insbesondere NEUE oder sich häufende Muster (</w:t>
+      </w:r>
+      <w:r>
+        <w:rPr>
+          <w:rFonts w:ascii="Consolas" w:hAnsi="Consolas"/>
+          <w:color w:val="882222"/>
+          <w:sz w:val="18"/>
+        </w:rPr>
+        <w:t>gate_veto_haeufigkeit</w:t>
+      </w:r>
+      <w:r>
+        <w:t>)</w:t>
+      </w:r>
+    </w:p>
+    <w:p>
+      <w:pPr>
+        <w:pStyle w:val="ListNumber"/>
+      </w:pPr>
+      <w:r>
+        <w:t>App-Neustart-Häufigkeit / Log-Auffälligkeiten (</w:t>
+      </w:r>
+      <w:r>
+        <w:rPr>
+          <w:rFonts w:ascii="Consolas" w:hAnsi="Consolas"/>
+          <w:color w:val="882222"/>
+          <w:sz w:val="18"/>
+        </w:rPr>
+        <w:t>log_auszug</w:t>
+      </w:r>
+      <w:r>
+        <w:t xml:space="preserve"> auf "Added job"/"Traceback"/"CRITICAL" durchsuchen)</w:t>
+      </w:r>
+    </w:p>
+    <w:p>
+      <w:pPr>
+        <w:pStyle w:val="ListNumber"/>
+      </w:pPr>
+      <w:r>
+        <w:t>Wartezeit bis Auflösung je Outcome-Status (Median/Mittelwert, getrennt nach gleichem Kalendertag wie Erstellung vs. späterem Tag - siehe [[project_zai_gegenpruefungslogik]] für die Methodik, warum diese Trennung nötig ist)</w:t>
+      </w:r>
+    </w:p>
+    <w:p>
+      <w:pPr>
+        <w:pStyle w:val="ListNumber"/>
+      </w:pPr>
+      <w:r>
+        <w:t>Stop-Loss-MFE-Analyse (</w:t>
+      </w:r>
+      <w:r>
+        <w:rPr>
+          <w:rFonts w:ascii="Consolas" w:hAnsi="Consolas"/>
+          <w:color w:val="882222"/>
+          <w:sz w:val="18"/>
+        </w:rPr>
+        <w:t>compute_sl_mfe_analyse()</w:t>
+      </w:r>
+      <w:r>
+        <w:t>) - Quote der SL-Fälle mit zwischenzeitlich positivem MFE trotz spätem Stop (siehe Abschnitt 2.6)</w:t>
+      </w:r>
+    </w:p>
+    <w:p>
+      <w:pPr>
+        <w:pStyle w:val="ListNumber"/>
+      </w:pPr>
+      <w:r>
+        <w:t>Fazit-Selbsteinschätzung-Verteilung (</w:t>
+      </w:r>
+      <w:r>
+        <w:rPr>
+          <w:rFonts w:ascii="Consolas" w:hAnsi="Consolas"/>
+          <w:color w:val="882222"/>
+          <w:sz w:val="18"/>
+        </w:rPr>
+        <w:t>fazit_folgen</w:t>
+      </w:r>
+      <w:r>
+        <w:t xml:space="preserve">: ja/nein/mit_vorbehalt) je Assetklasse UND Aktionstyp (echter Trade vs. HALTEN) - insbesondere ob "ja"/"nein" inzwischen auch bei echten Trade-Empfehlungen (ERÖFFNEN/KAUFEN) auftreten, nicht nur bei HALTEN, und ob </w:t>
+      </w:r>
+      <w:r>
+        <w:rPr>
+          <w:rFonts w:ascii="Consolas" w:hAnsi="Consolas"/>
+          <w:color w:val="882222"/>
+          <w:sz w:val="18"/>
+        </w:rPr>
+        <w:t>selbst_halten_outcome_status</w:t>
+      </w:r>
+      <w:r>
+        <w:t xml:space="preserve"> inzwischen erste aufgelöste Fälle zeigt (siehe Abschnitt 2.9).</w:t>
+      </w:r>
+    </w:p>
+    <w:p>
+      <w:pPr>
+        <w:jc w:val="left"/>
+      </w:pPr>
+      <w:r>
+        <w:t>Diese zehn Punkte werden IMMER kurz durchgegangen, auch wenn der Anlass für den Export etwas anderes war - Auffälligkeiten ausserhalb der eigentlichen Fragestellung nicht ignorieren (siehe z.B. den ISOC/X136-Ticker-Fund, der nebenbei beim Durchgehen von Punkt 6 auffiel).</w:t>
+      </w:r>
+    </w:p>
+    <w:p>
+      <w:pPr>
+        <w:pStyle w:val="Heading3"/>
+      </w:pPr>
+      <w:r>
+        <w:t>2.1a Export-Vollständigkeits-Check vor jeder NEUEN Fragestellung (verbindlich)</w:t>
+      </w:r>
+    </w:p>
+    <w:p>
+      <w:pPr>
+        <w:jc w:val="left"/>
+      </w:pPr>
+      <w:r>
+        <w:t>Auslöser: wiederholt aufgetreten (29.07. Konfidenz-CRV/SL-Korrelation, 30.07. Z.ai-6-Pipelines-Assetklassen-Zuordnung, 30.07. ATR-Perzentil-Veraltungs-Check)</w:t>
+      </w:r>
+    </w:p>
+    <w:p>
+      <w:pPr>
+        <w:pStyle w:val="ListBullet"/>
+      </w:pPr>
+      <w:r>
+        <w:t>bevor eine Frage beantwortet wird, die NICHT bereits vom festen</w:t>
+      </w:r>
+    </w:p>
+    <w:p>
+      <w:pPr>
+        <w:jc w:val="left"/>
+      </w:pPr>
+      <w:r>
+        <w:t xml:space="preserve">Kennzahlen-Katalog (2.1) abgedeckt ist, aktiv prüfen, ob </w:t>
+      </w:r>
+      <w:r>
+        <w:rPr>
+          <w:rFonts w:ascii="Consolas" w:hAnsi="Consolas"/>
+          <w:color w:val="882222"/>
+          <w:sz w:val="18"/>
+        </w:rPr>
+        <w:t>extract_notebook_diagnose.py</w:t>
+      </w:r>
+      <w:r>
+        <w:t xml:space="preserve"> die dafür nötigen Rohdaten überhaupt exportiert</w:t>
+      </w:r>
+    </w:p>
+    <w:p>
+      <w:pPr>
+        <w:pStyle w:val="ListBullet"/>
+      </w:pPr>
+      <w:r>
+        <w:t>nicht stillschweigend mit vorhandenen, aber eigentlich unpassenden Daten</w:t>
+      </w:r>
+    </w:p>
+    <w:p>
+      <w:pPr>
+        <w:jc w:val="left"/>
+      </w:pPr>
+      <w:r>
+        <w:t>behelfen oder die Frage unbeantwortet lassen.</w:t>
+      </w:r>
+    </w:p>
+    <w:p>
+      <w:pPr>
+        <w:jc w:val="left"/>
+      </w:pPr>
+      <w:r>
+        <w:rPr>
+          <w:b/>
+        </w:rPr>
+        <w:t>Vorgehen:</w:t>
+      </w:r>
+    </w:p>
+    <w:p>
+      <w:pPr>
+        <w:pStyle w:val="ListNumber"/>
+      </w:pPr>
+      <w:r>
+        <w:t>Export-Top-Level-Keys durchsehen (</w:t>
+      </w:r>
+      <w:r>
+        <w:rPr>
+          <w:rFonts w:ascii="Consolas" w:hAnsi="Consolas"/>
+          <w:color w:val="882222"/>
+          <w:sz w:val="18"/>
+        </w:rPr>
+        <w:t>data.keys()</w:t>
+      </w:r>
+      <w:r>
+        <w:t>) - existiert bereits eine passende Sektion?</w:t>
+      </w:r>
+    </w:p>
+    <w:p>
+      <w:pPr>
+        <w:pStyle w:val="ListNumber"/>
+      </w:pPr>
+      <w:r>
+        <w:t>Falls eine verwandte, aber zu enge Sektion existiert (z.B. eine Preishistorie nur für eine Teilmenge Symbole): pruefen, ob sie fuer die konkrete Frage ausreicht, oder ob sie strukturell den falschen Ausschnitt liefert.</w:t>
+      </w:r>
+    </w:p>
+    <w:p>
+      <w:pPr>
+        <w:pStyle w:val="ListNumber"/>
+      </w:pPr>
+      <w:r>
+        <w:t xml:space="preserve">Falls nötig: eine neue, MINIMALE Export-Funktion nach dem etablierten Muster ergänzen (eigene </w:t>
+      </w:r>
+      <w:r>
+        <w:rPr>
+          <w:rFonts w:ascii="Consolas" w:hAnsi="Consolas"/>
+          <w:color w:val="882222"/>
+          <w:sz w:val="18"/>
+        </w:rPr>
+        <w:t>_xxx(conn) -&gt; dict</w:t>
+      </w:r>
+      <w:r>
+        <w:t xml:space="preserve">-Funktion, reine Lesefunktion/Aggregation, in </w:t>
+      </w:r>
+      <w:r>
+        <w:rPr>
+          <w:rFonts w:ascii="Consolas" w:hAnsi="Consolas"/>
+          <w:color w:val="882222"/>
+          <w:sz w:val="18"/>
+        </w:rPr>
+        <w:t>main()</w:t>
+      </w:r>
+      <w:r>
+        <w:t xml:space="preserve"> eingehängt) - keine Sonderlösung nur für diese eine Frage, sondern eine wiederverwendbare Sektion (siehe z.B. </w:t>
+      </w:r>
+      <w:r>
+        <w:rPr>
+          <w:rFonts w:ascii="Consolas" w:hAnsi="Consolas"/>
+          <w:color w:val="882222"/>
+          <w:sz w:val="18"/>
+        </w:rPr>
+        <w:t>_preishistorie_ueberholte_symbole()</w:t>
+      </w:r>
+      <w:r>
+        <w:t xml:space="preserve">, </w:t>
+      </w:r>
+      <w:r>
+        <w:rPr>
+          <w:rFonts w:ascii="Consolas" w:hAnsi="Consolas"/>
+          <w:color w:val="882222"/>
+          <w:sz w:val="18"/>
+        </w:rPr>
+        <w:t>_deribit_cross_check_verlauf()</w:t>
+      </w:r>
+      <w:r>
+        <w:t xml:space="preserve"> als Referenzmuster).</w:t>
+      </w:r>
+    </w:p>
+    <w:p>
+      <w:pPr>
+        <w:pStyle w:val="ListNumber"/>
+      </w:pPr>
+      <w:r>
+        <w:t xml:space="preserve">Skript-Änderung dem Nutzer explizit zur Bestätigung vorlegen (siehe </w:t>
+      </w:r>
+      <w:r>
+        <w:rPr>
+          <w:rFonts w:ascii="Consolas" w:hAnsi="Consolas"/>
+          <w:color w:val="882222"/>
+          <w:sz w:val="18"/>
+        </w:rPr>
+        <w:t>Basisinfos/Fakten_Entscheidungsmappe.md</w:t>
+      </w:r>
+      <w:r>
+        <w:t>-Konvention: Code-Änderungen brauchen Bestätigung), dann am Notebook laufen lassen + zurücksynchronisieren lassen, bevor die eigentliche Analyse fortgesetzt wird.</w:t>
+      </w:r>
+    </w:p>
+    <w:p>
+      <w:pPr>
+        <w:jc w:val="left"/>
+      </w:pPr>
+      <w:r>
+        <w:t>Bewusst NICHT: aus fehlenden Daten eine Vermutung machen und diese als Befund ausgeben - fehlende Exportabdeckung ist ein Blocker für die Fragestellung, kein Grund für eine ungeprüfte Annahme.</w:t>
+      </w:r>
+    </w:p>
+    <w:p>
+      <w:pPr>
+        <w:pStyle w:val="Heading3"/>
+      </w:pPr>
+      <w:r>
+        <w:t>2.2 Vorher-Hypothese (Lerneffekt-Kern)</w:t>
+      </w:r>
+    </w:p>
+    <w:p>
+      <w:pPr>
+        <w:jc w:val="left"/>
+      </w:pPr>
+      <w:r>
+        <w:t>Bei jeder Änderung, deren Wirkung im Betrieb beobachtet werden soll: VOR dem nächsten Export kurz notieren (in der jeweiligen Memory-Datei oder im Regelwerksmanual-Nachtrag), WAS konkret erwartet wird. Beim nächsten Export dann ehrlich prüfen, ob das eingetreten ist - nicht die Beobachtung nachträglich passend interpretieren.</w:t>
+      </w:r>
+    </w:p>
+    <w:p>
+      <w:pPr>
+        <w:jc w:val="left"/>
+      </w:pPr>
       <w:r>
         <w:rPr>
           <w:b/>
@@ -1034,61 +1146,29 @@
         <w:t>Wichtige Einschränkung:</w:t>
       </w:r>
       <w:r>
-        <w:t xml:space="preserve"> bei reinen LLM-Kontext-Ergänzungen ohne Gate (z.B. die</w:t>
+        <w:t xml:space="preserve"> bei reinen LLM-Kontext-Ergänzungen ohne Gate (z.B. die FOMC-Regel) ist ein hartes Vorher/Nachher-Signal oft NICHT sauber isolierbar - das LLM-Verhalten ist nicht deterministisch reproduzierbar, und ein einzelner beobachteter Fall beweist nichts. In diesem Fall ehrlich vermerken: "keine belastbare Erfolgsmessung möglich, nur qualitative Beobachtung" statt eine Scheingenauigkeit vorzutäuschen. Ein hartes Vorher/Nachher-Signal ist nur bei Klasse-2/3-Änderungen (deterministische Logik) realistisch erwartbar.</w:t>
       </w:r>
     </w:p>
     <w:p>
-      <w:pPr/>
-      <w:r>
-        <w:t>FOMC-Regel) ist ein hartes Vorher/Nachher-Signal oft NICHT sauber isolierbar - das</w:t>
+      <w:pPr>
+        <w:pStyle w:val="Heading3"/>
+      </w:pPr>
+      <w:r>
+        <w:t>2.2a Mehrtägige Beobachtung vor Vollabschluss neuer Bausteine/Features (Nachtrag 30.07.)</w:t>
       </w:r>
     </w:p>
     <w:p>
-      <w:pPr/>
-      <w:r>
-        <w:t>LLM-Verhalten ist nicht deterministisch reproduzierbar, und ein einzelner</w:t>
+      <w:pPr>
+        <w:jc w:val="left"/>
+      </w:pPr>
+      <w:r>
+        <w:t>Auslöser: sowohl beim Konfidenz-Prompt-Fix als auch bei den Krypto- Relativwert-Bausteinen (Signal-Stabilität/ATR-Perzentil/BTC-Relativwert, siehe [[project_krypto_relativwert_bausteine]]) wurde ein neues Feature NICHT direkt nach der synthetischen Verifikation als abgeschlossen markiert, sondern bewusst offengehalten, bis mehrere Tage echter Produktionsdaten vorlagen - bisher nur informell in einzelnen Projekt-Memories festgehalten, nicht als Standard benannt.</w:t>
       </w:r>
     </w:p>
     <w:p>
-      <w:pPr/>
-      <w:r>
-        <w:t>beobachteter Fall beweist nichts. In diesem Fall ehrlich vermerken: "keine</w:t>
-      </w:r>
-    </w:p>
-    <w:p>
-      <w:pPr/>
-      <w:r>
-        <w:t>belastbare Erfolgsmessung möglich, nur qualitative Beobachtung" statt eine</w:t>
-      </w:r>
-    </w:p>
-    <w:p>
-      <w:pPr/>
-      <w:r>
-        <w:t>Scheingenauigkeit vorzutäuschen. Ein hartes Vorher/Nachher-Signal ist nur bei</w:t>
-      </w:r>
-    </w:p>
-    <w:p>
-      <w:pPr/>
-      <w:r>
-        <w:t>Klasse-2/3-Änderungen (deterministische Logik) realistisch erwartbar.</w:t>
-      </w:r>
-    </w:p>
-    <w:p>
-      <w:pPr>
-        <w:pStyle w:val="Heading3"/>
-      </w:pPr>
-      <w:r>
-        <w:t>2.2a Mehrtägige Beobachtung vor Vollabschluss neuer Bausteine/Features (Nachtrag 30.07.)</w:t>
-      </w:r>
-    </w:p>
-    <w:p>
-      <w:pPr/>
-      <w:r>
-        <w:t>Auslöser: sowohl beim Konfidenz-Prompt-Fix als auch bei den Krypto-Relativwert-Bausteinen (Signal-Stabilität/ATR-Perzentil/BTC-Relativwert) wurde ein neues Feature NICHT direkt nach der synthetischen Verifikation als abgeschlossen markiert, sondern bewusst offengehalten, bis mehrere Tage echter Produktionsdaten vorlagen - bisher nur informell in einzelnen Projekt-Memories festgehalten, nicht als Standard benannt.</w:t>
-      </w:r>
-    </w:p>
-    <w:p>
-      <w:pPr/>
+      <w:pPr>
+        <w:jc w:val="left"/>
+      </w:pPr>
       <w:r>
         <w:rPr>
           <w:b/>
@@ -1137,217 +1217,630 @@
       </w:r>
     </w:p>
     <w:p>
-      <w:pPr/>
-      <w:r>
-        <w:t>Kurze, stichwortartige Zusammenfassung nach jeder tieferen Export-Analyse: "was</w:t>
+      <w:pPr>
+        <w:jc w:val="left"/>
+      </w:pPr>
+      <w:r>
+        <w:t xml:space="preserve">Kurze, stichwortartige Zusammenfassung nach jeder tieferen Export-Analyse: "was haben wir bei diesem Export gelernt, das wir beim letzten nicht wussten" - als Memory-Eintrag (Typ </w:t>
+      </w:r>
+      <w:r>
+        <w:rPr>
+          <w:rFonts w:ascii="Consolas" w:hAnsi="Consolas"/>
+          <w:color w:val="882222"/>
+          <w:sz w:val="18"/>
+        </w:rPr>
+        <w:t>project</w:t>
+      </w:r>
+      <w:r>
+        <w:t>), nicht nur im Chat-Verlauf, damit es durchsuchbar bleibt und nicht verloren geht. Format wie bereits etabliert (siehe z.B. [[project_notebook_quickcheck_2026-07-27]]).</w:t>
       </w:r>
     </w:p>
     <w:p>
-      <w:pPr/>
-      <w:r>
-        <w:t>haben wir bei diesem Export gelernt, das wir beim letzten nicht wussten" - als</w:t>
+      <w:pPr>
+        <w:pStyle w:val="Heading3"/>
+      </w:pPr>
+      <w:r>
+        <w:t>2.4 Kein fester Rhythmus, aber feste Tiefe</w:t>
       </w:r>
     </w:p>
     <w:p>
-      <w:pPr/>
-      <w:r>
-        <w:t xml:space="preserve">Memory-Eintrag (Typ </w:t>
-      </w:r>
-      <w:r>
-        <w:rPr>
-          <w:rFonts w:ascii="Consolas" w:hAnsi="Consolas"/>
-        </w:rPr>
-        <w:t>project</w:t>
-      </w:r>
-      <w:r>
-        <w:t>), nicht nur im Chat-Verlauf, damit es durchsuchbar</w:t>
+      <w:pPr>
+        <w:jc w:val="left"/>
+      </w:pPr>
+      <w:r>
+        <w:t>Der Nutzer holt Notebook-Exporte unregelmäßig, je nach Bedarf - das bleibt so, kein Vorschlag für einen festen Zeitplan. Aber unabhängig vom Anlass gilt: einmal angefangen, wird der volle Katalog aus 2.1 durchgegangen, nicht nur die ursprünglich gestellte Frage.</w:t>
       </w:r>
     </w:p>
     <w:p>
-      <w:pPr/>
-      <w:r>
-        <w:t>bleibt und nicht verloren geht. Format wie bereits etabliert (siehe z.B.</w:t>
+      <w:pPr>
+        <w:pStyle w:val="Heading3"/>
+      </w:pPr>
+      <w:r>
+        <w:t>2.5 Symbol-/Konzentrations-Check vor jeder Muster-Interpretation (verbindlich)</w:t>
       </w:r>
     </w:p>
     <w:p>
-      <w:pPr/>
-      <w:r>
-        <w:t>[[project_notebook_quickcheck_2026-07-27]]).</w:t>
+      <w:pPr>
+        <w:jc w:val="left"/>
+      </w:pPr>
+      <w:r>
+        <w:t>Auslöser: die R-5.10-Analyse (29.07., siehe [[project_r510_konfidenz_veto_analyse_29_07]]) zeigte eine naiv alarmierende Zahl (n=80, 55% Win-Rate, +0,64 CRV bei konfidenz-vetoten Spot-Signalen), die sich bei genauerem Hinsehen als Artefakt einer Handvoll gut laufender Symbole entpuppte (5 Symbole = 29/29 Treffer, ohne sie nur noch 29,4% WR bei den restlichen 51). Eine zweite, strukturell ähnliche Prüfung am selben Tag (Hebel-Konfidenz-Bänder) ergab dagegen ein robustes Ergebnis - der Unterschied wurde erst durch diesen Check sichtbar.</w:t>
       </w:r>
     </w:p>
     <w:p>
       <w:pPr>
-        <w:pStyle w:val="Heading3"/>
-      </w:pPr>
-      <w:r>
-        <w:t>2.4 Kein fester Rhythmus, aber feste Tiefe</w:t>
-      </w:r>
-    </w:p>
-    <w:p>
-      <w:pPr/>
-      <w:r>
-        <w:t>Der Nutzer holt Notebook-Exporte unregelmäßig, je nach Bedarf - das bleibt so, kein</w:t>
-      </w:r>
-    </w:p>
-    <w:p>
-      <w:pPr/>
-      <w:r>
-        <w:t>Vorschlag für einen festen Zeitplan. Aber unabhängig vom Anlass gilt: einmal</w:t>
-      </w:r>
-    </w:p>
-    <w:p>
-      <w:pPr/>
-      <w:r>
-        <w:t>angefangen, wird der volle Katalog aus 2.1 durchgegangen, nicht nur die ursprünglich</w:t>
-      </w:r>
-    </w:p>
-    <w:p>
-      <w:pPr/>
-      <w:r>
-        <w:t>gestellte Frage.</w:t>
-      </w:r>
-    </w:p>
-    <w:p>
-      <w:pPr>
-        <w:pStyle w:val="Heading3"/>
-      </w:pPr>
-      <w:r>
-        <w:t>2.6 Mehrebenen-Erfolgsmessung: striktes Outcome vs. MFE/Mindestziel (Nachtrag 30.07.)</w:t>
-      </w:r>
-    </w:p>
-    <w:p>
-      <w:pPr/>
+        <w:jc w:val="left"/>
+      </w:pPr>
       <w:r>
         <w:rPr>
           <w:b/>
         </w:rPr>
-        <w:t xml:space="preserve">Auslöser: </w:t>
-      </w:r>
-      <w:r>
-        <w:t xml:space="preserve">Nutzer-Frage, ob und wie Erfolgsquoten auf mehreren Ebenen geprüft werden - neben dem strikten </w:t>
-      </w:r>
-      <w:r>
-        <w:rPr>
-          <w:rFonts w:ascii="Consolas" w:hAnsi="Consolas"/>
-        </w:rPr>
-        <w:t>outcome_status</w:t>
-      </w:r>
-      <w:r>
-        <w:t xml:space="preserve"> (TP/SL/Liquidation/abgelaufen) tracken wir bereits zwei weichere Zwischenebenen (</w:t>
-      </w:r>
-      <w:r>
-        <w:rPr>
-          <w:rFonts w:ascii="Consolas" w:hAnsi="Consolas"/>
-        </w:rPr>
-        <w:t>outcome_max_realisiertes_crv</w:t>
-      </w:r>
-      <w:r>
-        <w:t xml:space="preserve">/MFE, </w:t>
-      </w:r>
-      <w:r>
-        <w:rPr>
-          <w:rFonts w:ascii="Consolas" w:hAnsi="Consolas"/>
-        </w:rPr>
-        <w:t>outcome_mindestziel_erreicht_am</w:t>
-      </w:r>
-      <w:r>
-        <w:t>), die bisher nie systematisch gegen den strikten Outcome verschnitten wurden.</w:t>
+        <w:t>Ab sofort verbindlich, bevor eine Win-Rate/CRV-Kennzahl aus Veto-Schatten-, Provider-Performance- oder Konfidenz-Band-Daten als "Muster"/"Erkenntnis" interpretiert oder gar in eine Handlungsempfehlung übersetzt wird:</w:t>
       </w:r>
     </w:p>
     <w:p>
-      <w:pPr/>
+      <w:pPr>
+        <w:pStyle w:val="ListNumber"/>
+      </w:pPr>
+      <w:r>
+        <w:t>Anzahl unterschiedlicher Symbole in der Stichprobe ermitteln (nicht nur Gesamt-n).</w:t>
+      </w:r>
+    </w:p>
+    <w:p>
+      <w:pPr>
+        <w:pStyle w:val="ListNumber"/>
+      </w:pPr>
+      <w:r>
+        <w:t>Win-Rate/CRV zusätzlich OHNE die 3-5 häufigsten Symbole berechnen.</w:t>
+      </w:r>
+    </w:p>
+    <w:p>
+      <w:pPr>
+        <w:pStyle w:val="ListNumber"/>
+      </w:pPr>
+      <w:r>
+        <w:t>Bewegt sich die Kennzahl dabei deutlich (&gt;10 Prozentpunkte WR oder Vorzeichenwechsel beim CRV), gilt der Befund als NICHT robust - vermutlich Symbol-/Rally-Artefakt, nicht als Kalibrierungslücke behandeln, keine Schwellenwert-Änderung darauf stützen.</w:t>
+      </w:r>
+    </w:p>
+    <w:p>
+      <w:pPr>
+        <w:pStyle w:val="ListNumber"/>
+      </w:pPr>
+      <w:r>
+        <w:t>Bleibt die Kennzahl stabil, gilt der Befund als robust und kann als echte Erkenntnis dokumentiert und diskutiert werden.</w:t>
+      </w:r>
+    </w:p>
+    <w:p>
+      <w:pPr>
+        <w:jc w:val="left"/>
+      </w:pPr>
       <w:r>
         <w:rPr>
           <w:b/>
         </w:rPr>
-        <w:t xml:space="preserve">Kernidee: </w:t>
-      </w:r>
-      <w:r>
-        <w:t>eine reine Win/Loss-Quote vermischt zwei grundverschiedene Fehlerbilder - "Richtung war komplett falsch" und "Richtung war zwischenzeitlich richtig, aber zu eng gestoppt/schlechte Positionsführung". Diese zwei Fälle brauchen unterschiedliche Fixes (Prompt-/Fakten-Korrektur vs. Stop-Platzierung) und sollten nie in einer einzigen Kennzahl verschwinden.</w:t>
+        <w:t>Nachgeschärfte Mindestschwelle (Nachtrag 29.07., externe Recherche zu Backtest-Overfitting - Bailey/Lopez de Prado, "The Probability of Backtest Overfitting"; Harvey/Liu/Zhu zu Multiple-Testing bei Handelsstrategien):</w:t>
+      </w:r>
+      <w:r>
+        <w:t xml:space="preserve"> ein aus einem Backtest abgeleitetes Muster wird NIE operationalisiert (kein Gate, kein Deckel, keine Schwellenwert-Änderung), solange (a) n &lt; 50 ODER (b) ein einzelnes Symbol &gt; 20-25% der Fälle stellt. Bei geclusterten Beobachtungen (mehrere Signale desselben Symbols aus derselben Marktbewegung) ist die EFFEKTIVE Stichprobengröße die Anzahl distinkter Symbole, nicht die Roh-Zeilenzahl - analog zu "clustered standard errors" in der Ökonometrie. Jede Analyse-Zusammenfassung weist deshalb IMMER beide Zahlen aus: Roh-n UND Anzahl distinkter Symbole.</w:t>
       </w:r>
     </w:p>
     <w:p>
-      <w:pPr/>
+      <w:pPr>
+        <w:jc w:val="left"/>
+      </w:pPr>
+      <w:r>
+        <w:t>Zusätzlich: informell nacheinander getestete Hypothesen (z.B. "Deckel bauen" → "Gegenteil scheint zu gelten" → "Kontrolle zeigt Artefakt") sind ein Multiple-Testing-Szenario - ein gefundener Effekt gilt bei jeder Zwischenstufe zunächst nur als hypothesengenerierend, nicht als bestätigt, bis er nach unabhängiger Replikation (neuer Zeitraum/neue Symbole) noch Bestand hat.</w:t>
+      </w:r>
+    </w:p>
+    <w:p>
+      <w:pPr>
+        <w:jc w:val="left"/>
+      </w:pPr>
+      <w:r>
+        <w:t>Diese Prüfung wird in Abschnitt 3 der jeweiligen Analyse-Zusammenfassung (Chat oder Memory) kurz mit ausgewiesen (Roh-n, Anzahl Symbole, WR mit/ohne Top-N), nicht nur das Endergebnis genannt.</w:t>
+      </w:r>
+    </w:p>
+    <w:p>
+      <w:pPr>
+        <w:pStyle w:val="Heading3"/>
+      </w:pPr>
+      <w:r>
+        <w:t>2.5.1 Klarstellung: was der Check NICHT bedeutet (Nachtrag 29.07.)</w:t>
+      </w:r>
+    </w:p>
+    <w:p>
+      <w:pPr>
+        <w:jc w:val="left"/>
+      </w:pPr>
+      <w:r>
+        <w:t>Auslöser: Nutzer-Nachfrage, ob eine bewusst schmale Watchlist (z.B. nur BTC/ETH/SOL) das System damit faktisch unbenutzbar macht, und ob die Handelslogik überhaupt von Diversifikation abhängen sollte (Gegenbeispiel des Nutzers: bei Hebel laufen aktuell sowohl BTC als auch ein Memecoin - an fehlender Asset-Vielfalt kann und sollte es also nicht liegen).</w:t>
+      </w:r>
+    </w:p>
+    <w:p>
+      <w:pPr>
+        <w:jc w:val="left"/>
+      </w:pPr>
       <w:r>
         <w:rPr>
           <w:b/>
         </w:rPr>
-        <w:t xml:space="preserve">Konkrete Prüfung (`compute_sl_mfe_analyse()`, agent/krypto/backward_tracking.py): </w:t>
-      </w:r>
-      <w:r>
-        <w:t>von allen Signalen mit outcome_status == stop_loss_erreicht, welcher Anteil zeigt trotzdem einen positiven MFE-Wert (der Kurs lief zwischenzeitlich profitabel, bevor er zurückdrehte)? Ein erster Blick auf echte Daten (30.07., Hebel, n=23 mit MFE-Daten von 57 SL-Fällen) zeigte 87% mit positivem MFE, 9 davon erreichten sogar das Mindestziel vor dem Stop - bestätigt aus einem neuen Blickwinkel den bereits behobenen Enge-Stop-Loss-Befund vom 28.07., OHNE dass neue Daten gesammelt werden mussten - reine Verschneidung bereits vorhandener Felder.</w:t>
+        <w:t>Der eigentliche Maßstab ist Unabhängigkeit der Beobachtungen, nicht Anzahl der Symbole.</w:t>
+      </w:r>
+      <w:r>
+        <w:t xml:space="preserve"> Symbol-Vielfalt ist nur der aktuell nächstliegende PROXY dafür, weil die bisherigen Datenmengen ihre scheinbare Größe oft aus wiederholtem Cooldown-Re-Signalisieren DESSELBEN Coins während EINER zusammenhängenden Marktbewegung beziehen (viele DB-Zeilen, aber wenige echte, unabhängige Marktereignisse dahinter). Daraus folgt:</w:t>
       </w:r>
     </w:p>
     <w:p>
-      <w:pPr/>
+      <w:pPr>
+        <w:pStyle w:val="ListBullet"/>
+      </w:pPr>
       <w:r>
         <w:rPr>
           <w:b/>
         </w:rPr>
-        <w:t xml:space="preserve">Wichtig, gleiche Einschränkung wie überall in diesem Dokument: </w:t>
-      </w:r>
-      <w:r>
-        <w:t>diese weichere Ebene hat NICHT automatisch mehr Fälle als die strikte (im konkreten Fall eher weniger: 22-36 vs. 71 Hebel-Signale insgesamt) - der Wert liegt nicht in der Stichprobengröße, sondern in der zusätzlichen Trennschärfe. Symbol-Konzentrations-Check (2.5) gilt hier genauso - compute_sl_mfe_analyse() weist anzahl_distinkte_symbole_bei_positivem_mfe/haeufigstes_symbol_anteil_pct deshalb immer mit aus.</w:t>
+        <w:t>Eine schmale, bewusst gewählte Watchlist (wenige Symbole) ist für sich genommen KEIN Konzentrationsproblem.</w:t>
+      </w:r>
+      <w:r>
+        <w:t xml:space="preserve"> Dieselben 2-3 Symbole über einen langen Zeitraum hinweg, der mehrere echte, unterschiedliche Marktphasen (Bulle/Bär/Seitwärts) abdeckt, liefern genauso unabhängige Datenpunkte wie viele verschiedene Symbole - nur über die Zeit-Achse gestreut statt über die Symbol-Achse. Das Betriebs-System selbst braucht keine Symbol-Vielfalt, um zu funktionieren.</w:t>
       </w:r>
     </w:p>
     <w:p>
-      <w:pPr/>
+      <w:pPr>
+        <w:pStyle w:val="ListBullet"/>
+      </w:pPr>
       <w:r>
         <w:rPr>
           <w:b/>
         </w:rPr>
-        <w:t xml:space="preserve">Allgemeine Lehre: </w:t>
-      </w:r>
-      <w:r>
-        <w:t>bei jeder neuen Kalibrierungsfrage aktiv prüfen, ob bereits vorhandene "weichere" Felder (MFE, Mindestziel, Richtungstreffer) eine zusätzliche Ebene liefern könnten, BEVOR neue Datenerhebung als einzige Option angenommen wird - oft steckt die zusätzliche Trennschärfe schon in Feldern, die nur noch nie in dieser Kombination ausgewertet wurden.</w:t>
+        <w:t>Die Handelslogik/Regeln sollen asset-agnostisch funktionieren</w:t>
+      </w:r>
+      <w:r>
+        <w:t xml:space="preserve"> (BTC und ein Memecoin gleichermaßen abgedeckt) - der Check unterstellt nicht das Gegenteil. Er prüft nur, ob eine KONKRETE Kennzahl (z.B. "46% Win-Rate bei Regel X") tatsächlich die generelle Wirkung der Regel zeigt, oder ob sie nur "diese 3 Symbole liefen in dieser einen Woche gut" beweist - was bei einer Schwellenwert-Änderung fälschlich auf ALLE künftigen Symbole/Situationen verallgemeinert würde.</w:t>
       </w:r>
     </w:p>
     <w:p>
       <w:pPr>
-        <w:pStyle w:val="Heading3"/>
-      </w:pPr>
-      <w:r>
-        <w:t>2.7 Plausibilitätsprüfung bei scheinbar eingefrorenen Kennzahlen (Nachtrag 30.07.)</w:t>
-      </w:r>
-    </w:p>
-    <w:p>
-      <w:pPr/>
-      <w:r>
-        <w:t xml:space="preserve">Auslöser: die ATR-/Volatilitäts-Perzentil-Kennzahl (Baustein 2 der Krypto-Relativwert-Bausteine) zeigte bei BTC/ETH/LINK/TAO/VIRTUAL/HYPE/INJ über 5 Beobachtungstage einen konstanten bzw. fast konstanten Wert (BTC durchgehend 0) - auf den ersten Blick ein Verdacht auf eingefrorene/veraltete Eingabedaten. Eine erste Prüfung bestätigte tatsächlich veraltete </w:t>
-      </w:r>
-      <w:r>
-        <w:rPr>
-          <w:rFonts w:ascii="Consolas" w:hAnsi="Consolas"/>
-        </w:rPr>
-        <w:t>price_history_ohlc</w:t>
-      </w:r>
-      <w:r>
-        <w:t xml:space="preserve">-Daten - aber nur auf der DESKTOP-Kopie, nicht auf dem eigentlichen Notebook-Produktivsystem (siehe </w:t>
-      </w:r>
-      <w:r>
-        <w:rPr>
-          <w:rFonts w:ascii="Consolas" w:hAnsi="Consolas"/>
-        </w:rPr>
-        <w:t>_ohlc_aktualitaet_je_symbol()</w:t>
-      </w:r>
-      <w:r>
-        <w:t>, Abschnitt 2.1a). Die Kennzahl selbst blieb aber auch mit nachweislich frischen Notebook-Daten unverändert - der ursprüngliche Verdacht war damit nicht erledigt, nur die naheliegendste Erklärung widerlegt.</w:t>
-      </w:r>
-    </w:p>
-    <w:p>
-      <w:pPr/>
+        <w:pStyle w:val="ListBullet"/>
+      </w:pPr>
       <w:r>
         <w:rPr>
           <w:b/>
         </w:rPr>
-        <w:t xml:space="preserve">Der entscheidende Schritt: </w:t>
-      </w:r>
-      <w:r>
-        <w:t>ein Kontrollgruppen-Vergleich, keine Einzelwert-Betrachtung. Andere Symbole (KAIA, KAITO, NEAR, ONDO) im selben Export, mit derselben Berechnungslogik, zeigten im selben Zeitraum deutliche Bewegung. Diese Symbole waren unabhängig bereits als Teil einer Altcoin-Rally dokumentiert - die Bewegung korreliert also mit einem bekannten, unabhängig bestätigten Marktereignis. Die "eingefrorenen" Symbole (BTC/ETH/Majors) hatten im selben Fenster schlicht kein vergleichbares Volatilitätsereignis - bei einer langsam geglätteten Kennzahl (hier: Wilder-ATR) ist ein über Tage konstanter Perzentilrang bei ruhigem Markt der ERWARTBARE Fall, kein Bug.</w:t>
+        <w:t>Bei einer schmalen Watchlist ist der Symbol-Check durch einen Zeitfenster-Unabhängigkeits-Check zu ERSETZEN bzw. zu ergänzen:</w:t>
+      </w:r>
+      <w:r>
+        <w:t xml:space="preserve"> sind die Gewinn-/Verlust-Fälle über mehrere klar unterschiedliche Marktphasen verteilt, oder stammen sie praktisch alle aus einer einzigen zusammenhängenden Bewegung? Gleiches Prinzip, andere Achse.</w:t>
       </w:r>
     </w:p>
     <w:p>
-      <w:pPr/>
+      <w:pPr>
+        <w:pStyle w:val="ListBullet"/>
+      </w:pPr>
+      <w:r>
+        <w:t>Die "&gt;10 Prozentpunkte"-Schwelle aus 2.5 ist bereits genau dafür gebaut, "ab welcher Menge kein Problem mehr" zu beantworten: nicht als feste Symbolanzahl, sondern als Test, ob der Effekt beim Entfernen der dominantesten paar Symbole verschwindet oder stabil bleibt.</w:t>
+      </w:r>
+    </w:p>
+    <w:p>
+      <w:pPr>
+        <w:pStyle w:val="Heading3"/>
+      </w:pPr>
+      <w:r>
+        <w:t>2.5.2 Zweites Fallbeispiel: R-5.10-Konfidenzschwelle (Nachtrag 30.07.)</w:t>
+      </w:r>
+    </w:p>
+    <w:p>
+      <w:pPr>
+        <w:jc w:val="left"/>
+      </w:pPr>
+      <w:r>
+        <w:t xml:space="preserve">Auslöser: eine Live-Test-Untersuchung zu moeglichem LLM-Inaktivitaets-Bias (Aktien/Rohstoffe/Themen-ETF, siehe Memory [[project_llm_optimierung_abdeckung_pruefung]]) fuehrte zur echten Ursache des Symptoms: dem R-5.10-Konfidenzschwellen-Veto in </w:t>
+      </w:r>
+      <w:r>
+        <w:rPr>
+          <w:rFonts w:ascii="Consolas" w:hAnsi="Consolas"/>
+          <w:color w:val="882222"/>
+          <w:sz w:val="18"/>
+        </w:rPr>
+        <w:t>risk_gate.py:: post_check()</w:t>
+      </w:r>
+      <w:r>
+        <w:t>. Eine erste Veto-Schatten-Auswertung fuer Krypto-Spot (n=106 aufgeloest, Win-Rate 41,5%, Ø realisiertes CRV +0,222) sah auf den ersten Blick belastbar aus (n&gt;=50 erfuellt) und fuehrte zu einer config.yaml-Aenderung (Konfidenzschwelle -5 Prozentpunkte je Regime, NUR Krypto-Spot).</w:t>
+      </w:r>
+    </w:p>
+    <w:p>
+      <w:pPr>
+        <w:jc w:val="left"/>
+      </w:pPr>
+      <w:r>
+        <w:rPr>
+          <w:b/>
+        </w:rPr>
+        <w:t>Der in 2.5 vorgeschriebene Symbol-Konzentrations-Check wurde bei dieser ersten Auswertung uebersprungen</w:t>
+      </w:r>
+      <w:r>
+        <w:t xml:space="preserve"> - erst beim nachtraeglichen Dokumentieren angewendet. Ergebnis: Top-5-Symbole (AKT, CAT, GRIFFAIN, KAITO, S) stellen 39,6% der Faelle; ohne sie faellt die Win-Rate auf 32,8% und das Ø realisierte CRV </w:t>
+      </w:r>
+      <w:r>
+        <w:rPr>
+          <w:b/>
+        </w:rPr>
+        <w:t>kippt im Vorzeichen</w:t>
+      </w:r>
+      <w:r>
+        <w:t xml:space="preserve"> von +0,222 auf -0,242 - exakt die in 2.5 als disqualifizierend definierte Bedingung. Die config.yaml-Aenderung wurde noch am selben Tag zurueckgenommen.</w:t>
+      </w:r>
+    </w:p>
+    <w:p>
+      <w:pPr>
+        <w:jc w:val="left"/>
+      </w:pPr>
+      <w:r>
+        <w:rPr>
+          <w:b/>
+        </w:rPr>
+        <w:t>Lehre:</w:t>
+      </w:r>
+      <w:r>
+        <w:t xml:space="preserve"> der Check muss VOR jeder Operationalisierung angewendet werden, nicht erst beim Dokumentieren danach - sonst wird eine bereits live gesetzte Aenderung auf nicht belastbarer Evidenz entdeckt, statt gar nicht erst gesetzt zu werden. Zweiter unabhaengiger Beleg (nach dem 29.07.-Fall in 2.5), dass genau dieses Muster - Konfidenzschwellen-Vetos, Krypto-Spot, scheinbar okay-grosses n - anfaellig fuer Symbol-/Rally-Artefakte ist.</w:t>
+      </w:r>
+    </w:p>
+    <w:p>
+      <w:pPr>
+        <w:jc w:val="left"/>
+      </w:pPr>
+      <w:r>
+        <w:t>Zusaetzlich bei derselben Gelegenheit festgestellt: die parallele CRV&lt;2,0-Veto-Teilauswertung (Krypto-Spot, n=18, urspruenglich als "Veto arbeitet korrekt" eingeordnet) unterschreitet die n&gt;=50-Mindestschwelle unabhaengig von der Konzentration (hier gut verteilt) - beide Krypto-Spot-Fragen bleiben damit offen, keine der beiden gilt als bestaetigt.</w:t>
+      </w:r>
+    </w:p>
+    <w:p>
+      <w:pPr>
+        <w:pStyle w:val="Heading3"/>
+      </w:pPr>
+      <w:r>
+        <w:t>2.5.3 Drittes Fallbeispiel: Marktscan-Score-Schwellen-Kalibrierung - Konzentration als Signal statt nur als Störfaktor (Nachtrag 30.07.)</w:t>
+      </w:r>
+    </w:p>
+    <w:p>
+      <w:pPr>
+        <w:jc w:val="left"/>
+      </w:pPr>
+      <w:r>
+        <w:t xml:space="preserve">Auslöser: die Frage, ob </w:t>
+      </w:r>
+      <w:r>
+        <w:rPr>
+          <w:rFonts w:ascii="Consolas" w:hAnsi="Consolas"/>
+          <w:color w:val="882222"/>
+          <w:sz w:val="18"/>
+        </w:rPr>
+        <w:t>score_kaufkandidat_ab=70</w:t>
+      </w:r>
+      <w:r>
+        <w:t>/</w:t>
+      </w:r>
+      <w:r>
+        <w:rPr>
+          <w:rFonts w:ascii="Consolas" w:hAnsi="Consolas"/>
+          <w:color w:val="882222"/>
+          <w:sz w:val="18"/>
+        </w:rPr>
+        <w:t>score_watchlist_wuerdig_ab=50</w:t>
+      </w:r>
+      <w:r>
+        <w:t xml:space="preserve"> (beide VORLAEUFIG) gut kalibriert sind. Ein Backtest gegen echte Notebook-Daten scheiterte am Symbol-Konzentrations-Check (2.5) - wenige Coins wurden immer wieder als Kandidat entdeckt, eine klassische Schwellen-Kalibrierung wäre auf dieser Basis nicht belastbar gewesen.</w:t>
+      </w:r>
+    </w:p>
+    <w:p>
+      <w:pPr>
+        <w:jc w:val="left"/>
+      </w:pPr>
+      <w:r>
+        <w:rPr>
+          <w:b/>
+        </w:rPr>
+        <w:t>Der entscheidende Perspektivwechsel:</w:t>
+      </w:r>
+      <w:r>
+        <w:t xml:space="preserve"> statt die Konzentration nur als Störfaktor zu behandeln (der eine Frage unbeantwortbar macht), wurde sie selbst zur Fragestellung - "warum wird derselbe Coin so oft wiederentdeckt, und sagt DAS etwas über die künftige Performance aus?" Ein eigens dafür konstruierter Backtest (Streak-Position vs. Forward-Return, siehe Memory [[project_krypto_relativwert_bausteine]] und Regelwerksmanual-Nachtrag "Marktscan-Reifegrad-Scoring") bestätigte sauber (n=70 Coins mit ≥4 Tages-Sichtungen, OHNE Konzentrationsproblem in diesem spezifischen Test): Win-Rate fällt monoton von 57% (3. Sichtung) auf 36% (5. Sichtung).</w:t>
+      </w:r>
+    </w:p>
+    <w:p>
+      <w:pPr>
+        <w:jc w:val="left"/>
+      </w:pPr>
+      <w:r>
+        <w:rPr>
+          <w:b/>
+        </w:rPr>
+        <w:t>Lehre:</w:t>
+      </w:r>
+      <w:r>
+        <w:t xml:space="preserve"> wenn der Symbol-Konzentrations-Check eine urspüngliche Fragestellung disqualifiziert, lohnt sich die Nachfrage, ob die Konzentration selbst (die Wiederholung) ein eigenständiges, bisher ungenutztes Signal ist - statt die Frage nur als "nicht beantwortbar" zu verwerfen. Bei der später gebauten Erfolgsmessung (Marktscan Teil 2) drehte sich diese Konzentration sogar zu einem PRAKTISCHEN Vorteil um: wenige distinkte Coins bedeuten günstigere gebündelte </w:t>
+      </w:r>
+      <w:r>
+        <w:rPr>
+          <w:rFonts w:ascii="Consolas" w:hAnsi="Consolas"/>
+          <w:color w:val="882222"/>
+          <w:sz w:val="18"/>
+        </w:rPr>
+        <w:t>get_simple_prices()</w:t>
+      </w:r>
+      <w:r>
+        <w:t>-Abrufe (ein API-Call für mehrere offene Messungen desselben Coins) statt vieler Einzelabrufe.</w:t>
+      </w:r>
+    </w:p>
+    <w:p>
+      <w:pPr>
+        <w:pStyle w:val="Heading3"/>
+      </w:pPr>
+      <w:r>
+        <w:t>2.5.4 Viertes Fallbeispiel: R-5.10 erneut geprüft bei 1,4x größerer Stichprobe - Konzentration gesunken, Vorzeichenwechsel bleibt (Nachtrag 01.08.)</w:t>
+      </w:r>
+    </w:p>
+    <w:p>
+      <w:pPr>
+        <w:jc w:val="left"/>
+      </w:pPr>
+      <w:r>
+        <w:t>Auslöser: eine allgemeine "Detailanalyse aller Messpunkte" gegen einen frischen Notebook-Export zeigte fuer den Krypto-Spot-Konfidenzschwellen-Veto (R-5.10) eine deutlich groessere Stichprobe als beim 2.5.2-Fund (n=148 statt n=106) mit Ø realisiertem CRV +0,334 - auf den ersten Blick eine noch belastbarere Bestaetigung des scheinbar positiven Befunds.</w:t>
+      </w:r>
+    </w:p>
+    <w:p>
+      <w:pPr>
+        <w:jc w:val="left"/>
+      </w:pPr>
+      <w:r>
+        <w:rPr>
+          <w:b/>
+        </w:rPr>
+        <w:t>Symbol-Konzentrations-Check diesmal VOR jeder Interpretation angewendet</w:t>
+      </w:r>
+      <w:r>
+        <w:t xml:space="preserve"> (gelernte Lehre aus 2.5.2): die Verteilung ist tatsaechlich breiter als beim ersten Fund - 22 Symbole, groesster Anteil nur 8,1% (AIOZ/IO je n=12), keine Top-5-Haeufung wie beim 39,6%-Befund von 29.07./30.07. Auf den ersten Blick sieht das nach einem entschaerften Konzentrationsproblem aus.</w:t>
+      </w:r>
+    </w:p>
+    <w:p>
+      <w:pPr>
+        <w:jc w:val="left"/>
+      </w:pPr>
+      <w:r>
+        <w:rPr>
+          <w:b/>
+        </w:rPr>
+        <w:t>Der Vorzeichenwechsel bleibt trotzdem bestehen, ausgeloest durch ein EINZELNES Symbol statt einer Gruppe:</w:t>
+      </w:r>
+      <w:r>
+        <w:t xml:space="preserve"> AIOZ allein (n=12, 8% der Faelle, 100% Take-Profit-Quote, Ø CRV +4,71) traegt den gesamten positiven Gesamtdurchschnitt. Ohne AIOZ faellt n=136 verbleibender Faelle auf Ø CRV </w:t>
+      </w:r>
+      <w:r>
+        <w:rPr>
+          <w:b/>
+        </w:rPr>
+        <w:t>-0,052</w:t>
+      </w:r>
+      <w:r>
+        <w:t xml:space="preserve"> - Vorzeichenwechsel, identisch disqualifizierend wie beim 2.5.2-Fund. Zusaetzlich: von allen 148 Einzel-Outcomes sind 91 (61,5%) negativ, nur 57 (38,5%) positiv - der positive Mittelwert ist eine Ausreisser-getriebene Verzerrung, kein Mehrheitsmuster.</w:t>
+      </w:r>
+    </w:p>
+    <w:p>
+      <w:pPr>
+        <w:jc w:val="left"/>
+      </w:pPr>
+      <w:r>
+        <w:rPr>
+          <w:b/>
+        </w:rPr>
+        <w:t>Lehre:</w:t>
+      </w:r>
+      <w:r>
+        <w:t xml:space="preserve"> eine breitere prozentuale Verteilung (keine Top-5-Gruppe &gt;10 Prozentpunkte) reicht allein nicht aus, um den Konzentrations-Check als bestanden zu werten - ein einzelner Ausreisser mit extremem CRV kann denselben Vorzeichenwechsel-Effekt auslösen wie eine Gruppen-Häufung. Die 2.5-Pruefung sollte daher immer BEIDES ansehen: prozentuale Verteilung UND "was passiert beim Entfernen des staerksten Einzelwerts". Die am 30.07. getroffene Entscheidung, den Krypto-Spot-R-5.10-Override nicht zu setzen, bleibt bei 1,4x groesserer Stichprobe bestaetigt - keine Revision noetig.</w:t>
+      </w:r>
+    </w:p>
+    <w:p>
+      <w:pPr>
+        <w:pStyle w:val="Heading3"/>
+      </w:pPr>
+      <w:r>
+        <w:t>2.6 Mehrebenen-Erfolgsmessung: striktes Outcome vs. MFE/Mindestziel (Nachtrag 30.07.)</w:t>
+      </w:r>
+    </w:p>
+    <w:p>
+      <w:pPr>
+        <w:jc w:val="left"/>
+      </w:pPr>
+      <w:r>
+        <w:t xml:space="preserve">Auslöser: Nutzer-Frage, ob und wie Erfolgsquoten auf mehreren Ebenen geprüft werden - neben dem strikten </w:t>
+      </w:r>
+      <w:r>
+        <w:rPr>
+          <w:rFonts w:ascii="Consolas" w:hAnsi="Consolas"/>
+          <w:color w:val="882222"/>
+          <w:sz w:val="18"/>
+        </w:rPr>
+        <w:t>outcome_status</w:t>
+      </w:r>
+      <w:r>
+        <w:t xml:space="preserve"> (TP/SL/Liquidation/abgelaufen) tracken wir bereits zwei weichere Zwischenebenen (</w:t>
+      </w:r>
+      <w:r>
+        <w:rPr>
+          <w:rFonts w:ascii="Consolas" w:hAnsi="Consolas"/>
+          <w:color w:val="882222"/>
+          <w:sz w:val="18"/>
+        </w:rPr>
+        <w:t>outcome_max_realisiertes_ crv</w:t>
+      </w:r>
+      <w:r>
+        <w:t xml:space="preserve">/MFE, </w:t>
+      </w:r>
+      <w:r>
+        <w:rPr>
+          <w:rFonts w:ascii="Consolas" w:hAnsi="Consolas"/>
+          <w:color w:val="882222"/>
+          <w:sz w:val="18"/>
+        </w:rPr>
+        <w:t>outcome_mindestziel_erreicht_am</w:t>
+      </w:r>
+      <w:r>
+        <w:t>), die bisher nie systematisch gegen den strikten Outcome verschnitten wurden.</w:t>
+      </w:r>
+    </w:p>
+    <w:p>
+      <w:pPr>
+        <w:jc w:val="left"/>
+      </w:pPr>
+      <w:r>
+        <w:rPr>
+          <w:b/>
+        </w:rPr>
+        <w:t>Kernidee:</w:t>
+      </w:r>
+      <w:r>
+        <w:t xml:space="preserve"> eine reine Win/Loss-Quote vermischt zwei grundverschiedene Fehlerbilder - "Richtung war komplett falsch" und "Richtung war zwischenzeitlich richtig, aber zu eng gestoppt/schlechte Positionsführung". Diese zwei Fälle brauchen unterschiedliche Fixes (Prompt-/Fakten-Korrektur vs. Stop-Platzierung) und sollten nie in einer einzigen Kennzahl verschwinden.</w:t>
+      </w:r>
+    </w:p>
+    <w:p>
+      <w:pPr>
+        <w:jc w:val="left"/>
+      </w:pPr>
+      <w:r>
+        <w:rPr>
+          <w:b/>
+        </w:rPr>
+        <w:t>Konkrete Prüfung (`compute_sl_mfe_analyse()`, `agent/krypto/ backward_tracking.py`):</w:t>
+      </w:r>
+      <w:r>
+        <w:t xml:space="preserve"> von allen Signalen mit </w:t>
+      </w:r>
+      <w:r>
+        <w:rPr>
+          <w:rFonts w:ascii="Consolas" w:hAnsi="Consolas"/>
+          <w:color w:val="882222"/>
+          <w:sz w:val="18"/>
+        </w:rPr>
+        <w:t>outcome_status == stop_loss_erreicht</w:t>
+      </w:r>
+      <w:r>
+        <w:t>, welcher Anteil zeigt trotzdem einen positiven MFE-Wert (der Kurs lief zwischenzeitlich profitabel, bevor er zurückdrehte)? Ein erster Blick auf echte Daten (30.07., Hebel, n=23 mit MFE-Daten von 57 SL-Fällen) zeigte 87% mit positivem MFE, 9 davon erreichten sogar das Mindestziel vor dem Stop - bestätigt aus einem neuen Blickwinkel den bereits behobenen Enge-Stop-Loss-Befund vom 28.07. (siehe [[project_enge_stop_loss_backtest_und_massnahmen]]), OHNE dass neue Daten gesammelt werden mussten - reine Verschneidung bereits vorhandener Felder.</w:t>
+      </w:r>
+    </w:p>
+    <w:p>
+      <w:pPr>
+        <w:jc w:val="left"/>
+      </w:pPr>
+      <w:r>
+        <w:rPr>
+          <w:b/>
+        </w:rPr>
+        <w:t>Wichtig, gleiche Einschränkung wie überall in diesem Dokument:</w:t>
+      </w:r>
+      <w:r>
+        <w:t xml:space="preserve"> diese weichere Ebene hat NICHT automatisch mehr Fälle als die strikte (im konkreten Fall eher weniger: 22-36 vs. 71 Hebel-Signale insgesamt) - der Wert liegt nicht in der Stichprobengröße, sondern in der zusätzlichen Trennschärfe. Symbol-Konzentrations-Check (2.5) gilt hier genauso - </w:t>
+      </w:r>
+      <w:r>
+        <w:rPr>
+          <w:rFonts w:ascii="Consolas" w:hAnsi="Consolas"/>
+          <w:color w:val="882222"/>
+          <w:sz w:val="18"/>
+        </w:rPr>
+        <w:t>compute_sl_mfe_analyse()</w:t>
+      </w:r>
+      <w:r>
+        <w:t xml:space="preserve"> weist </w:t>
+      </w:r>
+      <w:r>
+        <w:rPr>
+          <w:rFonts w:ascii="Consolas" w:hAnsi="Consolas"/>
+          <w:color w:val="882222"/>
+          <w:sz w:val="18"/>
+        </w:rPr>
+        <w:t>anzahl_distinkte_symbole_bei_positivem_ mfe</w:t>
+      </w:r>
+      <w:r>
+        <w:t>/</w:t>
+      </w:r>
+      <w:r>
+        <w:rPr>
+          <w:rFonts w:ascii="Consolas" w:hAnsi="Consolas"/>
+          <w:color w:val="882222"/>
+          <w:sz w:val="18"/>
+        </w:rPr>
+        <w:t>haeufigstes_symbol_anteil_pct</w:t>
+      </w:r>
+      <w:r>
+        <w:t xml:space="preserve"> deshalb immer mit aus.</w:t>
+      </w:r>
+    </w:p>
+    <w:p>
+      <w:pPr>
+        <w:jc w:val="left"/>
+      </w:pPr>
+      <w:r>
+        <w:rPr>
+          <w:b/>
+        </w:rPr>
+        <w:t>Allgemeine Lehre:</w:t>
+      </w:r>
+      <w:r>
+        <w:t xml:space="preserve"> bei jeder neuen Kalibrierungsfrage aktiv prüfen, ob bereits vorhandene "weichere" Felder (MFE, Mindestziel, Richtungstreffer) eine zusätzliche Ebene liefern koennten, BEVOR neue Datenerhebung als einzige Option angenommen wird - oft steckt die zusätzliche Trennschärfe schon in Feldern, die nur noch nie in dieser Kombination ausgewertet wurden.</w:t>
+      </w:r>
+    </w:p>
+    <w:p>
+      <w:pPr>
+        <w:pStyle w:val="Heading3"/>
+      </w:pPr>
+      <w:r>
+        <w:t>2.7 Plausibilitätsprüfung bei scheinbar eingefrorenen Kennzahlen (Nachtrag 30.07.)</w:t>
+      </w:r>
+    </w:p>
+    <w:p>
+      <w:pPr>
+        <w:jc w:val="left"/>
+      </w:pPr>
+      <w:r>
+        <w:t xml:space="preserve">Auslöser: die ATR-/Volatilitäts-Perzentil-Kennzahl (Baustein 2 der Krypto-Relativwert-Bausteine) zeigte bei BTC/ETH/LINK/TAO/VIRTUAL/HYPE/INJ über 5 Beobachtungstage einen konstanten bzw. fast konstanten Wert (BTC durchgehend 0) - auf den ersten Blick ein Verdacht auf eingefrorene/veraltete Eingabedaten. Eine erste Prüfung bestätigte tatsächlich veraltete </w:t>
+      </w:r>
+      <w:r>
+        <w:rPr>
+          <w:rFonts w:ascii="Consolas" w:hAnsi="Consolas"/>
+          <w:color w:val="882222"/>
+          <w:sz w:val="18"/>
+        </w:rPr>
+        <w:t>price_history_ohlc</w:t>
+      </w:r>
+      <w:r>
+        <w:t xml:space="preserve">-Daten - aber nur auf der DESKTOP-Kopie, nicht auf dem eigentlichen Notebook-Produktivsystem (siehe </w:t>
+      </w:r>
+      <w:r>
+        <w:rPr>
+          <w:rFonts w:ascii="Consolas" w:hAnsi="Consolas"/>
+          <w:color w:val="882222"/>
+          <w:sz w:val="18"/>
+        </w:rPr>
+        <w:t>_ohlc_aktualitaet_je_symbol()</w:t>
+      </w:r>
+      <w:r>
+        <w:t>, Abschnitt 2.1a). Die Kennzahl selbst blieb aber auch mit nachweislich frischen Notebook-Daten unverändert - der ursprüngliche Verdacht war damit nicht erledigt, nur die naheliegendste Erklärung widerlegt.</w:t>
+      </w:r>
+    </w:p>
+    <w:p>
+      <w:pPr>
+        <w:jc w:val="left"/>
+      </w:pPr>
+      <w:r>
+        <w:rPr>
+          <w:b/>
+        </w:rPr>
+        <w:t>Der entscheidende Schritt: ein Kontrollgruppen-Vergleich, keine Einzelwert- Betrachtung.</w:t>
+      </w:r>
+      <w:r>
+        <w:t xml:space="preserve"> Andere Symbole (KAIA, KAITO, NEAR, ONDO) im selben Export, mit derselben Berechnungslogik, zeigten im selben Zeitraum deutliche Bewegung. Diese Symbole waren unabhängig bereits als Teil einer Altcoin-Rally dokumentiert (siehe [[project_r510_konfidenz_veto_analyse_29_07]]) - die Bewegung korreliert also mit einem bekannten, unabhängig bestätigten Marktereignis. Die "eingefrorenen" Symbole (BTC/ETH/Majors) hatten im selben Fenster schlicht kein vergleichbares Volatilitätsereignis - bei einer langsam geglätteten Kennzahl (hier: Wilder-ATR) ist ein über Tage konstanter Perzentilrang bei ruhigem Markt der ERWARTBARE Fall, kein Bug.</w:t>
+      </w:r>
+    </w:p>
+    <w:p>
+      <w:pPr>
+        <w:jc w:val="left"/>
+      </w:pPr>
       <w:r>
         <w:rPr>
           <w:b/>
@@ -1376,7 +1869,7 @@
         <w:pStyle w:val="ListNumber"/>
       </w:pPr>
       <w:r>
-        <w:t>Prüfen, ob die bewegungslosen bzw. bewegten Fälle mit einem unabhängig bekannten Markt-/Datenereignis erklärbar sind. Eine Erklärung, die bereits aus einem anderen, unabhängigen Fund stammt, ist deutlich belastbarer als eine neu erfundene Ad-hoc-Begründung.</w:t>
+        <w:t>Prüfen, ob die bewegungslosen bzw. bewegten Fälle mit einem unabhängig bekannten Markt-/Datenereignis erklärbar sind (hier: die Altcoin-Rally- Gruppe aus einer anderen Analyse). Eine Erklärung, die bereits aus einem anderen, unabhängigen Fund stammt, ist deutlich belastbarer als eine neu erfundene Ad-hoc-Begründung.</w:t>
       </w:r>
     </w:p>
     <w:p>
@@ -1388,307 +1881,690 @@
       </w:r>
     </w:p>
     <w:p>
-      <w:pPr/>
+      <w:pPr>
+        <w:jc w:val="left"/>
+      </w:pPr>
       <w:r>
         <w:rPr>
           <w:b/>
         </w:rPr>
-        <w:t xml:space="preserve">Allgemeine Lehre: </w:t>
-      </w:r>
-      <w:r>
-        <w:t>ein konstanter Wert ist nicht automatisch ein Fehlersignal - bei langsam geglätteten Kennzahlen (Wilder-Glättung, gleitende Durchschnitte, Perzentilränge über lange Historien) ist Konstanz bei fehlendem zugrundeliegendem Ereignis der Normalfall. Der Fehlerverdacht entsteht oft erst durch fehlenden Kontrollgruppen-Vergleich.</w:t>
+        <w:t>Allgemeine Lehre:</w:t>
+      </w:r>
+      <w:r>
+        <w:t xml:space="preserve"> ein konstanter Wert ist nicht automatisch ein Fehlersignal - bei langsam geglätteten Kennzahlen (Wilder-Glättung, gleitende Durchschnitte, Perzentilränge über lange Historien) ist Konstanz bei fehlendem zugrundeliegendem Ereignis der Normalfall. Der Fehlerverdacht entsteht oft erst durch fehlenden Kontrollgruppen-Vergleich.</w:t>
       </w:r>
     </w:p>
     <w:p>
       <w:pPr>
-        <w:pStyle w:val="Heading2"/>
-      </w:pPr>
-      <w:r>
-        <w:t>3. Verwandte Dokumente</w:t>
+        <w:pStyle w:val="Heading3"/>
+      </w:pPr>
+      <w:r>
+        <w:t>2.8 Methodik-Vorlage: rechnerische Herleitung einer neuen Schwelle statt Schätzung (Nachtrag 30.07., Marktscan-CRV=0,8)</w:t>
       </w:r>
     </w:p>
     <w:p>
       <w:pPr>
-        <w:pStyle w:val="ListBullet"/>
-      </w:pPr>
-      <w:r>
-        <w:t>[[Fakten_Entscheidungsmappe.md]] - Entscheidungsraster für Fakten/Prompt-Regeln</w:t>
+        <w:jc w:val="left"/>
+      </w:pPr>
+      <w:r>
+        <w:t xml:space="preserve">Auslöser: für die Marktscan-Erfolgsmessung wurde ein neuer, eigenständiger CRV-Schwellenwert gebraucht (getrennt von </w:t>
+      </w:r>
+      <w:r>
+        <w:rPr>
+          <w:rFonts w:ascii="Consolas" w:hAnsi="Consolas"/>
+          <w:color w:val="882222"/>
+          <w:sz w:val="18"/>
+        </w:rPr>
+        <w:t>backward_tracking. richtungstreffer_mindest_crv=1,0</w:t>
+      </w:r>
+      <w:r>
+        <w:t>, da Marktscan-Kandidaten ein anderes Volatilitätsprofil haben als Watchlist-Assets). Statt eine Zahl zu schätzen oder den bestehenden Wert unreflektiert zu übernehmen, wurde die Schwelle rechnerisch aus echten Daten hergeleitet - als wiederverwendbare Vorlage für künftige Schwellen-Kalibrierungen hier festgehalten:</w:t>
       </w:r>
     </w:p>
     <w:p>
-      <w:pPr/>
-      <w:r>
-        <w:t>selbst (was landet wie im LLM-Prompt), ergänzt diese Methodik (wie wird eine</w:t>
-      </w:r>
-    </w:p>
-    <w:p>
-      <w:pPr/>
-      <w:r>
-        <w:t>Änderung an diesen Fakten getestet und verifiziert).</w:t>
-      </w:r>
-    </w:p>
-    <w:p>
-      <w:pPr>
-        <w:pStyle w:val="ListBullet"/>
-      </w:pPr>
-      <w:r>
-        <w:rPr>
-          <w:rFonts w:ascii="Consolas" w:hAnsi="Consolas"/>
-        </w:rPr>
-        <w:t>Regelwerksmanual.md</w:t>
-      </w:r>
-      <w:r>
-        <w:t xml:space="preserve"> - dokumentiert einzelne, bereits umgesetzte Regeln/Fixes</w:t>
-      </w:r>
-    </w:p>
-    <w:p>
-      <w:pPr/>
-      <w:r>
-        <w:t>inklusive ihres Verifikationsstands: ab jetzt mit der Stufen-Bezeichnung aus</w:t>
-      </w:r>
-    </w:p>
-    <w:p>
-      <w:pPr/>
-      <w:r>
-        <w:t>Abschnitt 0 statt einem unscharfen "erledigt".</w:t>
-      </w:r>
-    </w:p>
-    <w:p>
-      <w:pPr>
-        <w:pStyle w:val="Heading3"/>
-      </w:pPr>
-      <w:r>
-        <w:t>2.5 Symbol-/Konzentrations-Check vor jeder Muster-Interpretation (verbindlich)</w:t>
-      </w:r>
-    </w:p>
-    <w:p>
-      <w:pPr/>
-      <w:r>
-        <w:t>Ausloeser: die R-5.10-Analyse (29.07.) zeigte eine naiv alarmierende Zahl (n=80, 55% Win-Rate, +0,64 CRV bei konfidenz-vetoten Spot-Signalen), die sich bei genauerem Hinsehen als Artefakt einer Handvoll gut laufender Symbole entpuppte (5 Symbole = 29/29 Treffer, ohne sie nur noch 29,4% WR bei den restlichen 51). Eine zweite, strukturell aehnliche Pruefung am selben Tag (Hebel-Konfidenz-Baender) ergab dagegen ein robustes Ergebnis - der Unterschied wurde erst durch diesen Check sichtbar.</w:t>
-      </w:r>
-    </w:p>
-    <w:p>
-      <w:pPr/>
-      <w:r>
-        <w:t>Ab sofort verbindlich, bevor eine Win-Rate/CRV-Kennzahl aus Veto-Schatten-, Provider-Performance- oder Konfidenz-Band-Daten als "Muster"/"Erkenntnis" interpretiert oder gar in eine Handlungsempfehlung uebersetzt wird:</w:t>
-      </w:r>
-    </w:p>
-    <w:p>
       <w:pPr>
         <w:pStyle w:val="ListNumber"/>
       </w:pPr>
-      <w:r>
-        <w:t>Anzahl unterschiedlicher Symbole in der Stichprobe ermitteln (nicht nur Gesamt-n).</w:t>
-      </w:r>
-    </w:p>
-    <w:p>
-      <w:pPr>
-        <w:pStyle w:val="ListNumber"/>
-      </w:pPr>
-      <w:r>
-        <w:t>Win-Rate/CRV zusaetzlich OHNE die 3-5 haeufigsten Symbole berechnen.</w:t>
-      </w:r>
-    </w:p>
-    <w:p>
-      <w:pPr>
-        <w:pStyle w:val="ListNumber"/>
-      </w:pPr>
-      <w:r>
-        <w:t>Bewegt sich die Kennzahl dabei deutlich (&gt;10 Prozentpunkte WR oder Vorzeichenwechsel beim CRV), gilt der Befund als NICHT robust - vermutlich Symbol-/Rally-Artefakt, nicht als Kalibrierungsluecke behandeln, keine Schwellenwert-Aenderung darauf stuetzen.</w:t>
-      </w:r>
-    </w:p>
-    <w:p>
-      <w:pPr>
-        <w:pStyle w:val="ListNumber"/>
-      </w:pPr>
-      <w:r>
-        <w:t>Bleibt die Kennzahl stabil, gilt der Befund als robust und kann als echte Erkenntnis dokumentiert und diskutiert werden.</w:t>
-      </w:r>
-    </w:p>
-    <w:p>
-      <w:pPr/>
-      <w:r>
-        <w:t>Diese Pruefung wird in Abschnitt 3 der jeweiligen Analyse-Zusammenfassung (Chat oder Memory) kurz mit ausgewiesen (Anzahl Symbole, WR mit/ohne Top-N), nicht nur das Endergebnis genannt.</w:t>
-      </w:r>
-    </w:p>
-    <w:p>
-      <w:pPr>
-        <w:pStyle w:val="Heading4"/>
-      </w:pPr>
-      <w:r>
-        <w:t>2.5.1 Klarstellung: was der Check NICHT bedeutet (Nachtrag 29.07.)</w:t>
-      </w:r>
-    </w:p>
-    <w:p>
-      <w:pPr/>
-      <w:r>
-        <w:t>Ausloeser: Nutzer-Nachfrage, ob eine bewusst schmale Watchlist (z.B. nur BTC/ETH/SOL) das System damit faktisch unbenutzbar macht, und ob die Handelslogik ueberhaupt von Diversifikation abhaengen sollte (Gegenbeispiel des Nutzers: bei Hebel laufen aktuell sowohl BTC als auch ein Memecoin - an fehlender Asset-Vielfalt kann und sollte es also nicht liegen).</w:t>
-      </w:r>
-    </w:p>
-    <w:p>
-      <w:pPr/>
       <w:r>
         <w:rPr>
           <w:b/>
         </w:rPr>
-        <w:t xml:space="preserve">Der eigentliche Massstab ist Unabhaengigkeit der Beobachtungen, nicht Anzahl der Symbole. </w:t>
-      </w:r>
-      <w:r>
-        <w:t>Symbol-Vielfalt ist nur der aktuell naechstliegende Proxy dafuer, weil die bisherigen Datenmengen ihre scheinbare Groesse oft aus wiederholtem Cooldown-Re-Signalisieren DESSELBEN Coins waehrend EINER zusammenhaengenden Marktbewegung beziehen (viele DB-Zeilen, aber wenige echte, unabhaengige Marktereignisse dahinter). Daraus folgt:</w:t>
+        <w:t>Referenzgröße bestimmen</w:t>
+      </w:r>
+      <w:r>
+        <w:t>: Ø absolute Tagesbewegung der betroffenen Grundgesamtheit berechnen (hier: 13,9% für Marktscan-Kandidaten, deutlich höher als bei etablierten Watchlist-Assets - die Volatilitätsprofile unterscheiden sich, ein pauschal übernommener Wert wäre nicht passend gewesen).</w:t>
       </w:r>
     </w:p>
     <w:p>
       <w:pPr>
-        <w:pStyle w:val="ListBullet"/>
-      </w:pPr>
-      <w:r>
-        <w:t>Eine schmale, bewusst gewaehlte Watchlist (wenige Symbole) ist fuer sich genommen KEIN Konzentrationsproblem. Dieselben 2-3 Symbole ueber einen langen Zeitraum hinweg, der mehrere echte, unterschiedliche Marktphasen (Bulle/Baer/Seitwaerts) abdeckt, liefern genauso unabhaengige Datenpunkte wie viele verschiedene Symbole - nur ueber die Zeit-Achse gestreut statt ueber die Symbol-Achse. Das Betriebs-System selbst braucht keine Symbol-Vielfalt, um zu funktionieren.</w:t>
+        <w:pStyle w:val="ListNumber"/>
+      </w:pPr>
+      <w:r>
+        <w:rPr>
+          <w:b/>
+        </w:rPr>
+        <w:t>Forward-Return-Verteilung ermitteln</w:t>
+      </w:r>
+      <w:r>
+        <w:t>: an mehreren Zeit-Horizonten prüfen (hier 12-24h UND 3 Tage), an welchem Perzentil (P70-P75) sich ein sinnvoller Ziel-Move ablesen lässt. Wenn die Verteilungen an verschiedenen Horizonten nahezu identisch sind (hier: P70 +9,1% vs. +7,5%), reicht EIN Schwellenwert für mehrere Anwendungsfälle (schnelle UND mehrtägige Erfolge) - keine Notwendigkeit, zwei getrennte Regeln zu bauen.</w:t>
       </w:r>
     </w:p>
     <w:p>
       <w:pPr>
-        <w:pStyle w:val="ListBullet"/>
-      </w:pPr>
-      <w:r>
-        <w:t>Die Handelslogik/Regeln sollen asset-agnostisch funktionieren (BTC und ein Memecoin gleichermassen abgedeckt) - der Check unterstellt nicht das Gegenteil. Er prueft nur, ob eine konkrete Kennzahl (z.B. "46% Win-Rate bei Regel X") tatsaechlich die generelle Wirkung der Regel zeigt, oder ob sie nur "diese 3 Symbole liefen in dieser einen Woche gut" beweist - was bei einer Schwellenwert-Aenderung faelschlich auf ALLE kuenftigen Symbole/Situationen verallgemeinert wuerde.</w:t>
+        <w:pStyle w:val="ListNumber"/>
+      </w:pPr>
+      <w:r>
+        <w:rPr>
+          <w:b/>
+        </w:rPr>
+        <w:t>CRV-Äquivalent berechnen</w:t>
+      </w:r>
+      <w:r>
+        <w:t>: Ziel-Move ÷ Referenzgröße aus Schritt 1 ergibt eine Bandbreite (hier 0,65-0,94 aus P70-P75), Empfehlung = Mitte der Bandbreite (hier 0,8).</w:t>
       </w:r>
     </w:p>
     <w:p>
       <w:pPr>
-        <w:pStyle w:val="ListBullet"/>
-      </w:pPr>
-      <w:r>
-        <w:t>Bei einer schmalen Watchlist ist der Symbol-Check durch einen Zeitfenster-Unabhaengigkeits-Check zu ERSETZEN bzw. zu ergaenzen: sind die Gewinn-/Verlust-Faelle ueber mehrere klar unterschiedliche Marktphasen verteilt, oder stammen sie praktisch alle aus einer einzigen zusammenhaengenden Bewegung? Gleiches Prinzip, andere Achse.</w:t>
+        <w:pStyle w:val="ListNumber"/>
+      </w:pPr>
+      <w:r>
+        <w:rPr>
+          <w:b/>
+        </w:rPr>
+        <w:t>Nutzer-Bestätigung einholen</w:t>
+      </w:r>
+      <w:r>
+        <w:t>, bevor der Wert operationalisiert wird - eine rechnerisch hergeleitete Zahl ersetzt nicht die fachliche Freigabe, sie macht sie nur informierter.</w:t>
       </w:r>
     </w:p>
     <w:p>
       <w:pPr>
-        <w:pStyle w:val="ListBullet"/>
-      </w:pPr>
-      <w:r>
-        <w:t>Die "&gt;10 Prozentpunkte"-Schwelle aus 2.5 ist bereits genau dafuer gebaut, "ab welcher Menge kein Problem mehr" zu beantworten: nicht als feste Symbolanzahl, sondern als Test, ob der Effekt beim Entfernen der dominantesten paar Symbole verschwindet oder stabil bleibt.</w:t>
+        <w:jc w:val="left"/>
+      </w:pPr>
+      <w:r>
+        <w:rPr>
+          <w:b/>
+        </w:rPr>
+        <w:t>Allgemeine Lehre:</w:t>
+      </w:r>
+      <w:r>
+        <w:t xml:space="preserve"> wann immer ein neuer Schwellenwert für eine andere Grundgesamtheit als eine bereits bestehende Regel gebraucht wird (anderes Volatilitätsprofil, andere Zeithorizonte, andere Assetklasse), lohnt sich dieselbe 4-Schritte-Herleitung, statt einen bestehenden Wert unreflektiert zu kopieren ODER eine neue Zahl zu schätzen. Dieselbe Methodik gilt spiegelbildlich auch für zeitbasierte Schwellen (siehe die parallel hergeleiteten Werte </w:t>
+      </w:r>
+      <w:r>
+        <w:rPr>
+          <w:rFonts w:ascii="Consolas" w:hAnsi="Consolas"/>
+          <w:color w:val="882222"/>
+          <w:sz w:val="18"/>
+        </w:rPr>
+        <w:t>watchlist_heiss_fenster_stunden=48</w:t>
+      </w:r>
+      <w:r>
+        <w:t xml:space="preserve"> und </w:t>
+      </w:r>
+      <w:r>
+        <w:rPr>
+          <w:rFonts w:ascii="Consolas" w:hAnsi="Consolas"/>
+          <w:color w:val="882222"/>
+          <w:sz w:val="18"/>
+        </w:rPr>
+        <w:t>schnellerfolg_anteil_max=0,5</w:t>
+      </w:r>
+      <w:r>
+        <w:t xml:space="preserve"> im selben Marktscan-Nachtrag - beide aus beobachteten Verteilungen abgeleitet, nicht geschätzt).</w:t>
       </w:r>
     </w:p>
     <w:p>
       <w:pPr>
-        <w:pStyle w:val="Heading4"/>
-      </w:pPr>
-      <w:r>
-        <w:t>Nachgeschärfte Mindestschwelle (Nachtrag 29.07., externe Recherche zu Backtest-Overfitting)</w:t>
+        <w:pStyle w:val="Heading3"/>
+      </w:pPr>
+      <w:r>
+        <w:t>2.9 Fazit-Selbsteinschätzung (`eigene_einschaetzung.folgen`) — offener Kalibrierungs-Beobachtungspunkt (Nachtrag 01.08.)</w:t>
       </w:r>
     </w:p>
     <w:p>
-      <w:pPr/>
-      <w:r>
-        <w:t>Quellen: Bailey/Lopez de Prado, "The Probability of Backtest Overfitting"; Harvey/Liu/Zhu zu Multiple-Testing bei Handelsstrategien. Ein aus einem Backtest abgeleitetes Muster wird NIE operationalisiert (kein Gate, kein Deckel, keine Schwellenwert-Änderung), solange (a) n &lt; 50 ODER (b) ein einzelnes Symbol &gt; 20-25% der Fälle stellt. Bei geclusterten Beobachtungen (mehrere Signale desselben Symbols aus derselben Marktbewegung) ist die EFFEKTIVE Stichprobengröße die Anzahl distinkter Symbole, nicht die Roh-Zeilenzahl - analog zu "clustered standard errors" in der Ökonometrie. Jede Analyse-Zusammenfassung weist deshalb IMMER beide Zahlen aus: Roh-n UND Anzahl distinkter Symbole.</w:t>
+      <w:pPr>
+        <w:jc w:val="left"/>
+      </w:pPr>
+      <w:r>
+        <w:t xml:space="preserve">Auslöser: Nutzer-Beobachtung, noch nie ein Signal gesehen zu haben, bei dem Mistral im </w:t>
+      </w:r>
+      <w:r>
+        <w:rPr>
+          <w:rFonts w:ascii="Consolas" w:hAnsi="Consolas"/>
+          <w:color w:val="882222"/>
+          <w:sz w:val="18"/>
+        </w:rPr>
+        <w:t>eigene_einschaetzung.kurzfazit</w:t>
+      </w:r>
+      <w:r>
+        <w:t>/</w:t>
+      </w:r>
+      <w:r>
+        <w:rPr>
+          <w:rFonts w:ascii="Consolas" w:hAnsi="Consolas"/>
+          <w:color w:val="882222"/>
+          <w:sz w:val="18"/>
+        </w:rPr>
+        <w:t>folgen</w:t>
+      </w:r>
+      <w:r>
+        <w:t xml:space="preserve"> der eigenen Empfehlung mit "ja" zustimmt (siehe BEAMX-Signal, </w:t>
+      </w:r>
+      <w:r>
+        <w:rPr>
+          <w:rFonts w:ascii="Consolas" w:hAnsi="Consolas"/>
+          <w:color w:val="882222"/>
+          <w:sz w:val="18"/>
+        </w:rPr>
+        <w:t>fazit_folgen="mit_vorbehalt"</w:t>
+      </w:r>
+      <w:r>
+        <w:t>, dazu Z.ai mit abweichender eigener Richtungseinschätzung SHORT).</w:t>
       </w:r>
     </w:p>
     <w:p>
-      <w:pPr/>
-      <w:r>
-        <w:t>Zusätzlich: informell nacheinander getestete Hypothesen (z.B. "Deckel bauen" → "Gegenteil scheint zu gelten" → "Kontrolle zeigt Artefakt") sind ein Multiple-Testing-Szenario - ein gefundener Effekt gilt bei jeder Zwischenstufe zunächst nur als hypothesengenerierend, nicht als bestätigt, bis er nach unabhängiger Replikation (neuer Zeitraum/neue Symbole) noch Bestand hat.</w:t>
+      <w:pPr>
+        <w:jc w:val="left"/>
+      </w:pPr>
+      <w:r>
+        <w:rPr>
+          <w:b/>
+        </w:rPr>
+        <w:t>Befund (kompletter Notebook-Export, seit Einführung des Features 25.07.):</w:t>
       </w:r>
     </w:p>
     <w:p>
       <w:pPr>
-        <w:pStyle w:val="Heading4"/>
-      </w:pPr>
-      <w:r>
-        <w:t>2.5.2 Zweites Fallbeispiel: R-5.10-Konfidenzschwelle (Nachtrag 30.07.)</w:t>
+        <w:pStyle w:val="ListBullet"/>
+      </w:pPr>
+      <w:r>
+        <w:t xml:space="preserve">Hebel: </w:t>
+      </w:r>
+      <w:r>
+        <w:rPr>
+          <w:b/>
+        </w:rPr>
+        <w:t>0 von 572</w:t>
+      </w:r>
+      <w:r>
+        <w:t xml:space="preserve"> Signalen mit </w:t>
+      </w:r>
+      <w:r>
+        <w:rPr>
+          <w:rFonts w:ascii="Consolas" w:hAnsi="Consolas"/>
+          <w:color w:val="882222"/>
+          <w:sz w:val="18"/>
+        </w:rPr>
+        <w:t>fazit_folgen="ja"</w:t>
+      </w:r>
+      <w:r>
+        <w:t xml:space="preserve"> - in der gesamten Historie noch nie. 508 "mit_vorbehalt" (88,8%), 64 "nein" (11,2%).</w:t>
       </w:r>
     </w:p>
     <w:p>
-      <w:pPr/>
-      <w:r>
-        <w:t xml:space="preserve">Ausloeser: eine Live-Test-Untersuchung zu moeglichem LLM-Inaktivitaets-Bias (Aktien/Rohstoffe/Themen-ETF) fuehrte zur echten Ursache des Symptoms: dem R-5.10-Konfidenzschwellen-Veto in </w:t>
+      <w:pPr>
+        <w:pStyle w:val="ListBullet"/>
+      </w:pPr>
+      <w:r>
+        <w:t>Spot: nur 34 von 761 (4,5%) "ja", Rest "mit_vorbehalt" (95,5%). Nie "nein".</w:t>
+      </w:r>
+    </w:p>
+    <w:p>
+      <w:pPr>
+        <w:pStyle w:val="ListBullet"/>
+      </w:pPr>
+      <w:r>
+        <w:t>Gilt für Mistral UND Gemini gleichermaßen (Gemini-Hebel: 8 von 9 ebenfalls "mit_vorbehalt") - kein reiner Mistral-Artefakt.</w:t>
+      </w:r>
+    </w:p>
+    <w:p>
+      <w:pPr>
+        <w:pStyle w:val="ListBullet"/>
+      </w:pPr>
+      <w:r>
+        <w:t xml:space="preserve">Widerspricht direkt Regel 26/32 in </w:t>
       </w:r>
       <w:r>
         <w:rPr>
           <w:rFonts w:ascii="Consolas" w:hAnsi="Consolas"/>
+          <w:color w:val="882222"/>
+          <w:sz w:val="18"/>
         </w:rPr>
-        <w:t>risk_gate.py::post_check()</w:t>
-      </w:r>
-      <w:r>
-        <w:t>. Eine erste Veto-Schatten-Auswertung fuer Krypto-Spot (n=106 aufgeloest, Win-Rate 41,5%, Ø realisiertes CRV +0,222) sah auf den ersten Blick belastbar aus (n&gt;=50 erfuellt) und fuehrte zu einer config.yaml-Aenderung (Konfidenzschwelle -5 Prozentpunkte je Regime, NUR Krypto-Spot).</w:t>
+        <w:t>hebel_analyst.py</w:t>
+      </w:r>
+      <w:r>
+        <w:t>/</w:t>
+      </w:r>
+      <w:r>
+        <w:rPr>
+          <w:rFonts w:ascii="Consolas" w:hAnsi="Consolas"/>
+          <w:color w:val="882222"/>
+          <w:sz w:val="18"/>
+        </w:rPr>
+        <w:t>analyst.py</w:t>
+      </w:r>
+      <w:r>
+        <w:t xml:space="preserve"> ("'mit vorbehalt' ist... KEIN bequemer Standardfall... 'ja' und 'nein' sind gleichwertige, vollständige Antworten").</w:t>
       </w:r>
     </w:p>
     <w:p>
-      <w:pPr/>
-      <w:r>
-        <w:t>Der in 2.5 vorgeschriebene Symbol-Konzentrations-Check wurde bei dieser ersten Auswertung uebersprungen - erst beim nachtraeglichen Dokumentieren angewendet. Ergebnis: Top-5-Symbole (AKT, CAT, GRIFFAIN, KAITO, S) stellen 39,6% der Faelle; ohne sie faellt die Win-Rate auf 32,8% und das Ø realisierte CRV kippt im Vorzeichen von +0,222 auf -0,242 - exakt die in 2.5 als disqualifizierend definierte Bedingung. Die config.yaml-Aenderung wurde noch am selben Tag zurueckgenommen.</w:t>
+      <w:pPr>
+        <w:jc w:val="left"/>
+      </w:pPr>
+      <w:r>
+        <w:rPr>
+          <w:b/>
+        </w:rPr>
+        <w:t>Kreuztabelle `original_action` × `fazit_folgen` klärt das Muster auf:</w:t>
+      </w:r>
+      <w:r>
+        <w:t xml:space="preserve"> für eine ECHTE Trade-Empfehlung (ERÖFFNEN/KAUFEN) ist es praktisch IMMER "mit_vorbehalt" (Hebel: 220/220 = 100%, Spot: 22/24 = 92%) - "ja"/"nein" treten fast ausschließlich bei HALTEN-Entscheidungen auf. Nicht durch Z.ai-Widerspruch erklärbar: selbst wenn Z.ai der Richtung zustimmt (</w:t>
+      </w:r>
+      <w:r>
+        <w:rPr>
+          <w:rFonts w:ascii="Consolas" w:hAnsi="Consolas"/>
+          <w:color w:val="882222"/>
+          <w:sz w:val="18"/>
+        </w:rPr>
+        <w:t>zai_uebereinstimmung="ja"</w:t>
+      </w:r>
+      <w:r>
+        <w:t>), bleibt das Hebel-Fazit in 122 von 123 Fällen trotzdem "mit_vorbehalt" - die Hedging-Tendenz ist vom Ergebnis der eigenen Gegenprüfung unabhängig.</w:t>
       </w:r>
     </w:p>
     <w:p>
-      <w:pPr/>
-      <w:r>
-        <w:t>Lehre: der Check muss VOR jeder Operationalisierung angewendet werden, nicht erst beim Dokumentieren danach - sonst wird eine bereits live gesetzte Aenderung auf nicht belastbarer Evidenz entdeckt, statt gar nicht erst gesetzt zu werden. Zweiter unabhaengiger Beleg (nach dem 29.07.-Fall in 2.5), dass genau dieses Muster - Konfidenzschwellen-Vetos, Krypto-Spot, scheinbar okay-grosses n - anfaellig fuer Symbol-/Rally-Artefakte ist.</w:t>
+      <w:pPr>
+        <w:jc w:val="left"/>
+      </w:pPr>
+      <w:r>
+        <w:rPr>
+          <w:b/>
+        </w:rPr>
+        <w:t>Backtest-Versuch (01.08.) - aktuell NICHT durchführbar:</w:t>
+      </w:r>
+      <w:r>
+        <w:t xml:space="preserve"> von allen 71 "ja"/"nein"-Fällen (64 Hebel-nein + 34 Spot-ja, teils mit Aktions-Überlappung) hat </w:t>
+      </w:r>
+      <w:r>
+        <w:rPr>
+          <w:b/>
+        </w:rPr>
+        <w:t>keiner</w:t>
+      </w:r>
+      <w:r>
+        <w:t xml:space="preserve"> einen aufgelösten </w:t>
+      </w:r>
+      <w:r>
+        <w:rPr>
+          <w:rFonts w:ascii="Consolas" w:hAnsi="Consolas"/>
+          <w:color w:val="882222"/>
+          <w:sz w:val="18"/>
+        </w:rPr>
+        <w:t>selbst_halten_outcome_status</w:t>
+      </w:r>
+      <w:r>
+        <w:t xml:space="preserve"> (siehe Regel 28, </w:t>
+      </w:r>
+      <w:r>
+        <w:rPr>
+          <w:rFonts w:ascii="Consolas" w:hAnsi="Consolas"/>
+          <w:color w:val="882222"/>
+          <w:sz w:val="18"/>
+        </w:rPr>
+        <w:t>ist_reines_llm_halten</w:t>
+      </w:r>
+      <w:r>
+        <w:t xml:space="preserve">) - alle </w:t>
+      </w:r>
+      <w:r>
+        <w:rPr>
+          <w:rFonts w:ascii="Consolas" w:hAnsi="Consolas"/>
+          <w:color w:val="882222"/>
+          <w:sz w:val="18"/>
+        </w:rPr>
+        <w:t>None</w:t>
+      </w:r>
+      <w:r>
+        <w:t xml:space="preserve"> oder </w:t>
+      </w:r>
+      <w:r>
+        <w:rPr>
+          <w:rFonts w:ascii="Consolas" w:hAnsi="Consolas"/>
+          <w:color w:val="882222"/>
+          <w:sz w:val="18"/>
+        </w:rPr>
+        <w:t>nicht_anwendbar</w:t>
+      </w:r>
+      <w:r>
+        <w:t xml:space="preserve"> (Zonen fehlten oder das Feature ist erst seit 31.07. aktiv). Die paar echten KAUFEN/VERKAUFEN-"ja"-Fälle bei Spot (n=2+2) sind zusätzlich zu wenige und ebenfalls ohne aufgelösten </w:t>
+      </w:r>
+      <w:r>
+        <w:rPr>
+          <w:rFonts w:ascii="Consolas" w:hAnsi="Consolas"/>
+          <w:color w:val="882222"/>
+          <w:sz w:val="18"/>
+        </w:rPr>
+        <w:t>outcome_status</w:t>
+      </w:r>
+      <w:r>
+        <w:t>. Ein Vergleich "war das Hedging gerechtfertigt" (CRV/Win-Rate "ja" vs. "mit_vorbehalt") ist damit strukturell unmöglich, solange keine "ja"/"nein"-Fälle aufgelöst sind.</w:t>
       </w:r>
     </w:p>
     <w:p>
-      <w:pPr/>
-      <w:r>
-        <w:t>Zusaetzlich bei derselben Gelegenheit festgestellt: die parallele CRV&lt;2,0-Veto-Teilauswertung (Krypto-Spot, n=18, urspruenglich als "Veto arbeitet korrekt" eingeordnet) unterschreitet die n&gt;=50-Mindestschwelle unabhaengig von der Konzentration (hier gut verteilt) - beide Krypto-Spot-Fragen bleiben damit offen, keine der beiden gilt als bestaetigt.</w:t>
+      <w:pPr>
+        <w:jc w:val="left"/>
+      </w:pPr>
+      <w:r>
+        <w:rPr>
+          <w:b/>
+        </w:rPr>
+        <w:t>Bewusst NICHT sofort gefixt:</w:t>
+      </w:r>
+      <w:r>
+        <w:t xml:space="preserve"> eine Prompt-Nachschärfung würde das gleiche Risiko bergen wie beim Action-Bias-Fund (Regel 27, siehe Regelwerksmanual- Nachtrag "Regelwerk-Audit Stufe 3, Punkt 4") - ein zu forscher Zwang zur einen Seite kann den gegenteiligen Bias erzeugen. Erst beobachten, dann ggf. gezielt nachschärfen.</w:t>
       </w:r>
     </w:p>
     <w:p>
       <w:pPr>
-        <w:pStyle w:val="Heading3"/>
-      </w:pPr>
-      <w:r>
-        <w:t>2.5.3 Drittes Fallbeispiel: Marktscan-Score-Schwellen-Kalibrierung - Konzentration als Signal statt nur als Störfaktor (Nachtrag 30.07.)</w:t>
+        <w:jc w:val="left"/>
+      </w:pPr>
+      <w:r>
+        <w:rPr>
+          <w:b/>
+        </w:rPr>
+        <w:t>Wiedervorlage (kein festes Datum, siehe 2.2a "Mehrtägige Beobachtung"):</w:t>
+      </w:r>
+      <w:r>
+        <w:t xml:space="preserve"> sobald </w:t>
+      </w:r>
+      <w:r>
+        <w:rPr>
+          <w:rFonts w:ascii="Consolas" w:hAnsi="Consolas"/>
+          <w:color w:val="882222"/>
+          <w:sz w:val="18"/>
+        </w:rPr>
+        <w:t>selbst_halten_outcome_status</w:t>
+      </w:r>
+      <w:r>
+        <w:t xml:space="preserve"> erste aufgelöste Fälle zeigt (die Selbst-Halten-Schatten-Verfolgung braucht Wochen, um genug Fälle zu sammeln), den Backtest "Fazit-Kategorie vs. tatsächliches Outcome" wiederholen - dabei Symbol-Konzentrations-Check (2.5) UND Mindestschwelle n≥50 (2.5) beachten, da die Stichprobe bei "ja"/"nein" absehbar klein bleiben wird.</w:t>
       </w:r>
     </w:p>
     <w:p>
-      <w:r>
-        <w:t>Auslöser: die Frage, ob score_kaufkandidat_ab=70/score_watchlist_wuerdig_ab=50 (beide VORLAEUFIG) gut kalibriert sind. Ein Backtest gegen echte Notebook-Daten scheiterte am Symbol-Konzentrations-Check (2.5) - wenige Coins wurden immer wieder als Kandidat entdeckt, eine klassische Schwellen-Kalibrierung wäre auf dieser Basis nicht belastbar gewesen.</w:t>
+      <w:pPr>
+        <w:pStyle w:val="Heading3"/>
+      </w:pPr>
+      <w:r>
+        <w:t>2.10 Z.ai-"Gegenprüfung wäre richtiger"-These — geprüft und über LONG/SHORT-Symmetrietest WIDERLEGT (Nachtrag 01.08.)</w:t>
       </w:r>
     </w:p>
     <w:p>
-      <w:r>
-        <w:t>Der entscheidende Perspektivwechsel: statt die Konzentration nur als Störfaktor zu behandeln (der eine Frage unbeantwortbar macht), wurde sie selbst zur Fragestellung - "warum wird derselbe Coin so oft wiederentdeckt, und sagt DAS etwas über die künftige Performance aus?" Ein eigens dafür konstruierter Backtest (Streak-Position vs. Forward-Return, siehe Memory [[project_krypto_relativwert_bausteine]] und Regelwerksmanual-Nachtrag "Marktscan-Reifegrad-Scoring") bestätigte sauber (n=70 Coins mit ≥4 Tages-Sichtungen, OHNE Konzentrationsproblem in diesem spezifischen Test): Win-Rate fällt monoton von 57% (3. Sichtung) auf 36% (5. Sichtung).</w:t>
+      <w:pPr>
+        <w:jc w:val="left"/>
+      </w:pPr>
+      <w:r>
+        <w:t xml:space="preserve">Auslöser: Anschlussfrage an 2.9 - Mistrals LONG-Empfehlungen performen schlecht (18,6% Trefferquote, n=59 aufgelöst) UND Z.ai widerspricht ihnen in 88% der Fälle mit klarer Richtung (n=8 von 17 mit Z.ai-Wert). Erste Interpretation: Z.ai als informelles Meta-Label/Gegen-Check nutzen. </w:t>
+      </w:r>
+      <w:r>
+        <w:rPr>
+          <w:b/>
+        </w:rPr>
+        <w:t>Vom Nutzer explizit hinterfragt ("nicht bei halber Strecke halt machen") - Symmetrietest gefordert:</w:t>
+      </w:r>
+      <w:r>
+        <w:t xml:space="preserve"> wie performen Mistrals SHORT-Empfehlungen, und folgt Z.ai dort ebenfalls konsequent der jeweils anderen Seite?</w:t>
       </w:r>
     </w:p>
     <w:p>
-      <w:r>
-        <w:t>Lehre: wenn der Symbol-Konzentrations-Check eine urspüngliche Fragestellung disqualifiziert, lohnt sich die Nachfrage, ob die Konzentration selbst (die Wiederholung) ein eigenständiges, bisher ungenutztes Signal ist - statt die Frage nur als "nicht beantwortbar" zu verwerfen. Bei der später gebauten Erfolgsmessung (Marktscan Teil 2) drehte sich diese Konzentration sogar zu einem PRAKTISCHEN Vorteil um: wenige distinkte Coins bedeuten günstigere gebündelte get_simple_prices()-Abrufe (ein API-Call für mehrere offene Messungen desselben Coins) statt vieler Einzelabrufe.</w:t>
+      <w:pPr>
+        <w:jc w:val="left"/>
+      </w:pPr>
+      <w:r>
+        <w:rPr>
+          <w:b/>
+        </w:rPr>
+        <w:t>Ergebnis, WIDERLEGT die Gegenprüfungs-These:</w:t>
+      </w:r>
+    </w:p>
+    <w:tbl>
+      <w:tblPr>
+        <w:tblStyle w:val="LightGrid-Accent1"/>
+        <w:tblW w:type="auto" w:w="0"/>
+        <w:jc w:val="left"/>
+        <w:tblLook w:firstColumn="1" w:firstRow="1" w:lastColumn="0" w:lastRow="0" w:noHBand="0" w:noVBand="1" w:val="04A0"/>
+      </w:tblPr>
+      <w:tblGrid>
+        <w:gridCol w:w="2880"/>
+        <w:gridCol w:w="2880"/>
+        <w:gridCol w:w="2880"/>
+      </w:tblGrid>
+      <w:tr>
+        <w:tc>
+          <w:tcPr>
+            <w:tcW w:type="dxa" w:w="2880"/>
+          </w:tcPr>
+          <w:p>
+            <w:r>
+              <w:rPr>
+                <w:b/>
+              </w:rPr>
+            </w:r>
+            <w:r>
+              <w:rPr>
+                <w:b/>
+              </w:rPr>
+              <w:t>Richtung</w:t>
+            </w:r>
+          </w:p>
+        </w:tc>
+        <w:tc>
+          <w:tcPr>
+            <w:tcW w:type="dxa" w:w="2880"/>
+          </w:tcPr>
+          <w:p>
+            <w:r>
+              <w:rPr>
+                <w:b/>
+              </w:rPr>
+            </w:r>
+            <w:r>
+              <w:rPr>
+                <w:b/>
+              </w:rPr>
+              <w:t>n aufgelöst</w:t>
+            </w:r>
+          </w:p>
+        </w:tc>
+        <w:tc>
+          <w:tcPr>
+            <w:tcW w:type="dxa" w:w="2880"/>
+          </w:tcPr>
+          <w:p>
+            <w:r>
+              <w:rPr>
+                <w:b/>
+              </w:rPr>
+            </w:r>
+            <w:r>
+              <w:rPr>
+                <w:b/>
+              </w:rPr>
+              <w:t>Trefferquote</w:t>
+            </w:r>
+          </w:p>
+        </w:tc>
+      </w:tr>
+      <w:tr>
+        <w:tc>
+          <w:tcPr>
+            <w:tcW w:type="dxa" w:w="2880"/>
+          </w:tcPr>
+          <w:p>
+            <w:r/>
+            <w:r>
+              <w:t>Mistral LONG</w:t>
+            </w:r>
+          </w:p>
+        </w:tc>
+        <w:tc>
+          <w:tcPr>
+            <w:tcW w:type="dxa" w:w="2880"/>
+          </w:tcPr>
+          <w:p>
+            <w:r/>
+            <w:r>
+              <w:t>59</w:t>
+            </w:r>
+          </w:p>
+        </w:tc>
+        <w:tc>
+          <w:tcPr>
+            <w:tcW w:type="dxa" w:w="2880"/>
+          </w:tcPr>
+          <w:p>
+            <w:r/>
+            <w:r>
+              <w:t>18,6%</w:t>
+            </w:r>
+          </w:p>
+        </w:tc>
+      </w:tr>
+      <w:tr>
+        <w:tc>
+          <w:tcPr>
+            <w:tcW w:type="dxa" w:w="2880"/>
+          </w:tcPr>
+          <w:p>
+            <w:r/>
+            <w:r>
+              <w:t>Mistral SHORT</w:t>
+            </w:r>
+          </w:p>
+        </w:tc>
+        <w:tc>
+          <w:tcPr>
+            <w:tcW w:type="dxa" w:w="2880"/>
+          </w:tcPr>
+          <w:p>
+            <w:r/>
+            <w:r>
+              <w:t>9 (dedupliziert nach Symbol+Tag: bleibt 9)</w:t>
+            </w:r>
+          </w:p>
+        </w:tc>
+        <w:tc>
+          <w:tcPr>
+            <w:tcW w:type="dxa" w:w="2880"/>
+          </w:tcPr>
+          <w:p>
+            <w:r/>
+            <w:r>
+              <w:rPr>
+                <w:b/>
+              </w:rPr>
+              <w:t>0,0%</w:t>
+            </w:r>
+          </w:p>
+        </w:tc>
+      </w:tr>
+    </w:tbl>
+    <w:p/>
+    <w:p>
+      <w:pPr>
+        <w:jc w:val="left"/>
+      </w:pPr>
+      <w:r>
+        <w:t xml:space="preserve">SHORT performt nicht besser als LONG, sondern schlechter - widerspricht der Annahme "mit dem Bär-Trend gehen wäre richtig gewesen". Zusätzlich: </w:t>
+      </w:r>
+      <w:r>
+        <w:rPr>
+          <w:rFonts w:ascii="Consolas" w:hAnsi="Consolas"/>
+          <w:color w:val="882222"/>
+          <w:sz w:val="18"/>
+        </w:rPr>
+        <w:t>zai_eigene_richtung</w:t>
+      </w:r>
+      <w:r>
+        <w:t xml:space="preserve"> über ALLE 1336 Hebel-Signale (469 mit Wert) ist SHORT=246, NEUTRAL=222, </w:t>
+      </w:r>
+      <w:r>
+        <w:rPr>
+          <w:b/>
+        </w:rPr>
+        <w:t>LONG=1</w:t>
+      </w:r>
+      <w:r>
+        <w:t xml:space="preserve"> - Z.ai sagt praktisch nie LONG. Das erklärt die scheinbare Korrelation als Scheinzusammenhang: beide Größen (Mistral-LONG-Fehlschläge, Z.ais Dauer-Bär-Haltung) hängen unabhängig voneinander mit dem anhaltenden Bär-Regime zusammen, ohne dass Z.ai tatsächlich prädiktive Fähigkeit zeigt - der Beweis: wenn Z.ai Recht hätte, müssten SHORT-Trades (die praktisch immer mit Z.ais Dauerhaltung übereinstimmen) gut performen. Sie performen am schlechtesten von allen.</w:t>
       </w:r>
     </w:p>
     <w:p>
       <w:pPr>
-        <w:pStyle w:val="Heading3"/>
-      </w:pPr>
-      <w:r>
-        <w:t>2.8 Methodik-Vorlage: rechnerische Herleitung einer neuen Schwelle statt Schätzung (Nachtrag 30.07., Marktscan-CRV=0,8)</w:t>
+        <w:jc w:val="left"/>
+      </w:pPr>
+      <w:r>
+        <w:rPr>
+          <w:b/>
+        </w:rPr>
+        <w:t>Schlussfolgerung:</w:t>
+      </w:r>
+      <w:r>
+        <w:t xml:space="preserve"> das Problem ist RICHTUNGS-UNABHÄNGIG (LONG und SHORT beide schlecht, SHORT sogar schlechter) - kein Beleg für eine falsche Richtungswahl, sondern für einen anderen, richtungsneutralen Faktor. Damit gehört diese Spur NICHT zu einer neuen Meta-Labeling-/Gegenprüfungs-Regel, sondern zurück zum bereits bestehenden, noch ungelösten Thema in [[project_enge_stop_loss_backtest_und_massnahmen]] (~77% des CRV-Band- Einbruchs weiterhin unerklärt) - dort wurde am selben Tag ein neuer, konkreter Kandidat gefunden (Breakeven-/Teilgewinn-Lock, siehe dortiger Nachtrag 01.08.). Die Fazit-Vorbehalt-Beobachtung aus 2.9 bleibt davon unberührt gültig (eigenständiger Befund).</w:t>
       </w:r>
     </w:p>
     <w:p>
-      <w:r>
-        <w:t>Auslöser: für die Marktscan-Erfolgsmessung wurde ein neuer, eigenständiger CRV-Schwellenwert gebraucht (getrennt von backward_tracking. richtungstreffer_mindest_crv=1,0, da Marktscan-Kandidaten ein anderes Volatilitätsprofil haben als Watchlist-Assets). Statt eine Zahl zu schätzen oder den bestehenden Wert unreflektiert zu übernehmen, wurde die Schwelle rechnerisch aus echten Daten hergeleitet - als wiederverwendbare Vorlage für künftige Schwellen-Kalibrierungen hier festgehalten:</w:t>
+      <w:pPr>
+        <w:jc w:val="left"/>
+      </w:pPr>
+      <w:r>
+        <w:rPr>
+          <w:b/>
+        </w:rPr>
+        <w:t>Methodischer Punkt für künftige Analysen:</w:t>
+      </w:r>
+      <w:r>
+        <w:t xml:space="preserve"> eine auffällige Korrelation zwischen zwei Kennzahlen ist erst dann ein Kausal-/Prädiktivitäts-Beleg, wenn sie den Symmetrietest übersteht (hier: Spiegelfall SHORT statt nur LONG geprüft) - sonst bleibt offen, ob beide Größen nur einen gemeinsamen Dritt- faktor (hier: Bär-Regime) widerspiegeln.</w:t>
       </w:r>
     </w:p>
     <w:p>
-      <w:r>
-        <w:t>1. Referenzgröße bestimmen: Ø absolute Tagesbewegung der betroffenen Grundgesamtheit berechnen (hier: 13,9% für Marktscan-Kandidaten, deutlich höher als bei etablierten Watchlist-Assets - die Volatilitätsprofile unterscheiden sich, ein pauschal übernommener Wert wäre nicht passend gewesen).</w:t>
+      <w:pPr>
+        <w:spacing w:before="120"/>
+      </w:pPr>
+      <w:r>
+        <w:rPr>
+          <w:color w:val="AAAAAA"/>
+        </w:rPr>
+        <w:t>────────────────────────────────────────────────────────────</w:t>
       </w:r>
     </w:p>
     <w:p>
-      <w:r>
-        <w:t>2. Forward-Return-Verteilung ermitteln: an mehreren Zeit-Horizonten prüfen (hier 12-24h UND 3 Tage), an welchem Perzentil (P70-P75) sich ein sinnvoller Ziel-Move ablesen lässt. Wenn die Verteilungen an verschiedenen Horizonten nahezu identisch sind (hier: P70 +9,1% vs. +7,5%), reicht EIN Schwellenwert für mehrere Anwendungsfälle (schnelle UND mehrtägige Erfolge) - keine Notwendigkeit, zwei getrennte Regeln zu bauen.</w:t>
+      <w:pPr>
+        <w:pStyle w:val="Heading2"/>
+      </w:pPr>
+      <w:r>
+        <w:t>3. Verwandte Dokumente</w:t>
       </w:r>
     </w:p>
     <w:p>
-      <w:r>
-        <w:t>3. CRV-Äquivalent berechnen: Ziel-Move ÷ Referenzgröße aus Schritt 1 ergibt eine Bandbreite (hier 0,65-0,94 aus P70-P75), Empfehlung = Mitte der Bandbreite (hier 0,8).</w:t>
+      <w:pPr>
+        <w:pStyle w:val="ListBullet"/>
+      </w:pPr>
+      <w:r>
+        <w:t>[[Fakten_Entscheidungsmappe.md]] - Entscheidungsraster für Fakten/Prompt-Regeln selbst (was landet wie im LLM-Prompt), ergänzt diese Methodik (wie wird eine Änderung an diesen Fakten getestet und verifiziert).</w:t>
       </w:r>
     </w:p>
     <w:p>
-      <w:r>
-        <w:t>4. Nutzer-Bestätigung einholen, bevor der Wert operationalisiert wird - eine rechnerisch hergeleitete Zahl ersetzt nicht die fachliche Freigabe, sie macht sie nur informierter.</w:t>
-      </w:r>
-    </w:p>
-    <w:p>
-      <w:r>
-        <w:t>Allgemeine Lehre: wann immer ein neuer Schwellenwert für eine andere Grundgesamtheit als eine bereits bestehende Regel gebraucht wird (anderes Volatilitätsprofil, andere Zeithorizonte, andere Assetklasse), lohnt sich dieselbe 4-Schritte-Herleitung, statt einen bestehenden Wert unreflektiert zu kopieren ODER eine neue Zahl zu schätzen. Dieselbe Methodik gilt spiegelbildlich auch für zeitbasierte Schwellen (siehe die parallel hergeleiteten Werte watchlist_heiss_fenster_stunden=48 und schnellerfolg_anteil_max=0,5 im selben Marktscan-Nachtrag - beide aus beobachteten Verteilungen abgeleitet, nicht geschätzt).</w:t>
+      <w:pPr>
+        <w:pStyle w:val="ListBullet"/>
+      </w:pPr>
+      <w:r>
+        <w:rPr>
+          <w:rFonts w:ascii="Consolas" w:hAnsi="Consolas"/>
+          <w:color w:val="882222"/>
+          <w:sz w:val="18"/>
+        </w:rPr>
+        <w:t>Regelwerksmanual.md</w:t>
+      </w:r>
+      <w:r>
+        <w:t xml:space="preserve"> - dokumentiert einzelne, bereits umgesetzte Regeln/Fixes inklusive ihres Verifikationsstands: ab jetzt mit der Stufen-Bezeichnung aus Abschnitt 0 statt einem unscharfen "erledigt".</w:t>
       </w:r>
     </w:p>
     <w:sectPr>
@@ -2064,6 +2940,10 @@
     <w:name w:val="Normal"/>
     <w:qFormat/>
     <w:rsid w:val="00FC693F"/>
+    <w:rPr>
+      <w:rFonts w:ascii="Calibri" w:hAnsi="Calibri"/>
+      <w:sz w:val="20"/>
+    </w:rPr>
   </w:style>
   <w:style w:type="paragraph" w:styleId="Header">
     <w:name w:val="header"/>

</xml_diff>